<commit_message>
In der Doku Teil Steuerelemente defninieren hinzug
</commit_message>
<xml_diff>
--- a/MPA 2 Vorarbeit Texteditor mit PHP MVC.docx
+++ b/MPA 2 Vorarbeit Texteditor mit PHP MVC.docx
@@ -570,6 +570,13 @@
     </w:sdt>
     <w:sdt>
       <w:sdtPr>
+        <w:rPr>
+          <w:rFonts w:asciiTheme="minorHAnsi" w:eastAsiaTheme="minorHAnsi" w:hAnsiTheme="minorHAnsi" w:cstheme="minorBidi"/>
+          <w:color w:val="auto"/>
+          <w:sz w:val="22"/>
+          <w:szCs w:val="22"/>
+          <w:lang w:eastAsia="en-US"/>
+        </w:rPr>
         <w:id w:val="-1252884604"/>
         <w:docPartObj>
           <w:docPartGallery w:val="Table of Contents"/>
@@ -578,13 +585,8 @@
       </w:sdtPr>
       <w:sdtEndPr>
         <w:rPr>
-          <w:rFonts w:asciiTheme="minorHAnsi" w:eastAsiaTheme="minorHAnsi" w:hAnsiTheme="minorHAnsi" w:cstheme="minorBidi"/>
           <w:b/>
           <w:bCs/>
-          <w:color w:val="auto"/>
-          <w:sz w:val="22"/>
-          <w:szCs w:val="22"/>
-          <w:lang w:eastAsia="en-US"/>
         </w:rPr>
       </w:sdtEndPr>
       <w:sdtContent>
@@ -2300,7 +2302,7 @@
           <w:lang w:val="de-CH"/>
         </w:rPr>
       </w:pPr>
-      <w:bookmarkStart w:id="2" w:name="_Toc114749717"/>
+      <w:bookmarkStart w:id="2" w:name="_Toc114815350"/>
       <w:r>
         <w:rPr>
           <w:lang w:val="de-CH"/>
@@ -2475,6 +2477,7 @@
       </w:pPr>
       <w:r>
         <w:rPr>
+          <w:noProof/>
           <w:lang w:val="de-CH"/>
         </w:rPr>
         <w:lastRenderedPageBreak/>
@@ -2522,7 +2525,7 @@
           <w:lang w:val="de-CH"/>
         </w:rPr>
       </w:pPr>
-      <w:bookmarkStart w:id="5" w:name="_Toc114749718"/>
+      <w:bookmarkStart w:id="5" w:name="_Toc114815351"/>
       <w:r>
         <w:rPr>
           <w:lang w:val="de-CH"/>
@@ -2607,6 +2610,7 @@
       </w:pPr>
       <w:r>
         <w:rPr>
+          <w:noProof/>
           <w:lang w:val="de-CH"/>
         </w:rPr>
         <w:drawing>
@@ -2653,20 +2657,35 @@
           <w:lang w:val="de-CH"/>
         </w:rPr>
       </w:pPr>
+      <w:bookmarkStart w:id="6" w:name="_Toc114815352"/>
       <w:r>
         <w:t xml:space="preserve">Abbildung </w:t>
       </w:r>
-      <w:fldSimple w:instr=" SEQ Abbildung \* ARABIC ">
-        <w:r>
-          <w:rPr>
-            <w:noProof/>
-          </w:rPr>
-          <w:t>3</w:t>
-        </w:r>
-      </w:fldSimple>
+      <w:r>
+        <w:fldChar w:fldCharType="begin"/>
+      </w:r>
+      <w:r>
+        <w:instrText xml:space="preserve"> SEQ Abbildung \* ARABIC </w:instrText>
+      </w:r>
+      <w:r>
+        <w:fldChar w:fldCharType="separate"/>
+      </w:r>
+      <w:r>
+        <w:rPr>
+          <w:noProof/>
+        </w:rPr>
+        <w:t>3</w:t>
+      </w:r>
+      <w:r>
+        <w:rPr>
+          <w:noProof/>
+        </w:rPr>
+        <w:fldChar w:fldCharType="end"/>
+      </w:r>
       <w:r>
         <w:t>: Ordnerstruktur</w:t>
       </w:r>
+      <w:bookmarkEnd w:id="6"/>
     </w:p>
     <w:p>
       <w:pPr>
@@ -2712,7 +2731,7 @@
           <w:lang w:val="de-CH"/>
         </w:rPr>
       </w:pPr>
-      <w:bookmarkStart w:id="6" w:name="_Toc114757473"/>
+      <w:bookmarkStart w:id="7" w:name="_Toc114757473"/>
       <w:r>
         <w:rPr>
           <w:lang w:val="de-CH"/>
@@ -2725,7 +2744,7 @@
         </w:rPr>
         <w:t xml:space="preserve"> -Formular erstellen</w:t>
       </w:r>
-      <w:bookmarkEnd w:id="6"/>
+      <w:bookmarkEnd w:id="7"/>
     </w:p>
     <w:p>
       <w:pPr>
@@ -2763,7 +2782,7 @@
           <w:lang w:val="de-CH"/>
         </w:rPr>
       </w:pPr>
-      <w:bookmarkStart w:id="7" w:name="_Toc114757474"/>
+      <w:bookmarkStart w:id="8" w:name="_Toc114757474"/>
       <w:proofErr w:type="spellStart"/>
       <w:r>
         <w:rPr>
@@ -2772,7 +2791,7 @@
         <w:lastRenderedPageBreak/>
         <w:t>dashboard.php</w:t>
       </w:r>
-      <w:bookmarkEnd w:id="7"/>
+      <w:bookmarkEnd w:id="8"/>
       <w:proofErr w:type="spellEnd"/>
     </w:p>
     <w:p>
@@ -2780,17 +2799,31 @@
         <w:pStyle w:val="Beschriftung"/>
         <w:keepNext/>
       </w:pPr>
+      <w:bookmarkStart w:id="9" w:name="_Toc114815363"/>
       <w:r>
         <w:t xml:space="preserve">Tabelle </w:t>
       </w:r>
-      <w:fldSimple w:instr=" SEQ Tabelle \* ARABIC ">
-        <w:r>
-          <w:rPr>
-            <w:noProof/>
-          </w:rPr>
-          <w:t>1</w:t>
-        </w:r>
-      </w:fldSimple>
+      <w:r>
+        <w:fldChar w:fldCharType="begin"/>
+      </w:r>
+      <w:r>
+        <w:instrText xml:space="preserve"> SEQ Tabelle \* ARABIC </w:instrText>
+      </w:r>
+      <w:r>
+        <w:fldChar w:fldCharType="separate"/>
+      </w:r>
+      <w:r>
+        <w:rPr>
+          <w:noProof/>
+        </w:rPr>
+        <w:t>1</w:t>
+      </w:r>
+      <w:r>
+        <w:rPr>
+          <w:noProof/>
+        </w:rPr>
+        <w:fldChar w:fldCharType="end"/>
+      </w:r>
       <w:r>
         <w:t xml:space="preserve">: </w:t>
       </w:r>
@@ -2798,6 +2831,7 @@
       <w:r>
         <w:t>dashboard.php</w:t>
       </w:r>
+      <w:bookmarkEnd w:id="9"/>
       <w:proofErr w:type="spellEnd"/>
     </w:p>
     <w:tbl>
@@ -5941,7 +5975,7 @@
                 <w:color w:val="D4D4D4"/>
                 <w:sz w:val="21"/>
                 <w:szCs w:val="21"/>
-                <w:lang w:eastAsia="de-DE"/>
+                <w:lang w:val="en-GB" w:eastAsia="de-DE"/>
               </w:rPr>
             </w:pPr>
             <w:r>
@@ -5960,29 +5994,27 @@
                 <w:color w:val="808080"/>
                 <w:sz w:val="21"/>
                 <w:szCs w:val="21"/>
-                <w:lang w:eastAsia="de-DE"/>
+                <w:lang w:val="en-GB" w:eastAsia="de-DE"/>
               </w:rPr>
               <w:t>&lt;/</w:t>
             </w:r>
-            <w:proofErr w:type="spellStart"/>
             <w:r>
               <w:rPr>
                 <w:rFonts w:ascii="Consolas" w:eastAsia="Times New Roman" w:hAnsi="Consolas" w:cs="Times New Roman"/>
                 <w:color w:val="569CD6"/>
                 <w:sz w:val="21"/>
                 <w:szCs w:val="21"/>
-                <w:lang w:eastAsia="de-DE"/>
+                <w:lang w:val="en-GB" w:eastAsia="de-DE"/>
               </w:rPr>
               <w:t>script</w:t>
             </w:r>
-            <w:proofErr w:type="spellEnd"/>
             <w:r>
               <w:rPr>
                 <w:rFonts w:ascii="Consolas" w:eastAsia="Times New Roman" w:hAnsi="Consolas" w:cs="Times New Roman"/>
                 <w:color w:val="808080"/>
                 <w:sz w:val="21"/>
                 <w:szCs w:val="21"/>
-                <w:lang w:eastAsia="de-DE"/>
+                <w:lang w:val="en-GB" w:eastAsia="de-DE"/>
               </w:rPr>
               <w:t>&gt;</w:t>
             </w:r>
@@ -5996,7 +6028,7 @@
                 <w:color w:val="D4D4D4"/>
                 <w:sz w:val="21"/>
                 <w:szCs w:val="21"/>
-                <w:lang w:eastAsia="de-DE"/>
+                <w:lang w:val="en-GB" w:eastAsia="de-DE"/>
               </w:rPr>
             </w:pPr>
           </w:p>
@@ -6439,6 +6471,7 @@
           <w:lang w:val="de-CH"/>
         </w:rPr>
       </w:pPr>
+      <w:bookmarkStart w:id="10" w:name="_Toc114815353"/>
       <w:r>
         <w:rPr>
           <w:lang w:val="de-CH"/>
@@ -6482,6 +6515,7 @@
         </w:rPr>
         <w:t>: Das Aussehen des heruntergeladenen Texteditors</w:t>
       </w:r>
+      <w:bookmarkEnd w:id="10"/>
     </w:p>
     <w:p>
       <w:pPr>
@@ -6509,6 +6543,7 @@
       </w:pPr>
       <w:r>
         <w:rPr>
+          <w:noProof/>
           <w:lang w:val="de-CH"/>
         </w:rPr>
         <w:drawing>
@@ -6552,37 +6587,66 @@
       <w:pPr>
         <w:pStyle w:val="Beschriftung"/>
       </w:pPr>
+      <w:bookmarkStart w:id="11" w:name="_Toc114815354"/>
       <w:r>
         <w:t xml:space="preserve">Abbildung </w:t>
       </w:r>
-      <w:fldSimple w:instr=" SEQ Abbildung \* ARABIC ">
-        <w:r>
-          <w:rPr>
-            <w:noProof/>
-          </w:rPr>
-          <w:t>5</w:t>
-        </w:r>
-      </w:fldSimple>
+      <w:r>
+        <w:fldChar w:fldCharType="begin"/>
+      </w:r>
+      <w:r>
+        <w:instrText xml:space="preserve"> SEQ Abbildung \* ARABIC </w:instrText>
+      </w:r>
+      <w:r>
+        <w:fldChar w:fldCharType="separate"/>
+      </w:r>
+      <w:r>
+        <w:rPr>
+          <w:noProof/>
+        </w:rPr>
+        <w:t>5</w:t>
+      </w:r>
+      <w:r>
+        <w:rPr>
+          <w:noProof/>
+        </w:rPr>
+        <w:fldChar w:fldCharType="end"/>
+      </w:r>
       <w:r>
         <w:t>: Das Aussehen des heruntergeladenen Texteditors nach Anwendung von CSS</w:t>
       </w:r>
+      <w:bookmarkEnd w:id="11"/>
     </w:p>
     <w:p>
       <w:pPr>
         <w:pStyle w:val="Beschriftung"/>
         <w:keepNext/>
       </w:pPr>
+      <w:bookmarkStart w:id="12" w:name="_Toc114815364"/>
       <w:r>
         <w:t xml:space="preserve">Tabelle </w:t>
       </w:r>
-      <w:fldSimple w:instr=" SEQ Tabelle \* ARABIC ">
-        <w:r>
-          <w:rPr>
-            <w:noProof/>
-          </w:rPr>
-          <w:t>2</w:t>
-        </w:r>
-      </w:fldSimple>
+      <w:r>
+        <w:fldChar w:fldCharType="begin"/>
+      </w:r>
+      <w:r>
+        <w:instrText xml:space="preserve"> SEQ Tabelle \* ARABIC </w:instrText>
+      </w:r>
+      <w:r>
+        <w:fldChar w:fldCharType="separate"/>
+      </w:r>
+      <w:r>
+        <w:rPr>
+          <w:noProof/>
+        </w:rPr>
+        <w:t>2</w:t>
+      </w:r>
+      <w:r>
+        <w:rPr>
+          <w:noProof/>
+        </w:rPr>
+        <w:fldChar w:fldCharType="end"/>
+      </w:r>
       <w:r>
         <w:t xml:space="preserve">: </w:t>
       </w:r>
@@ -6594,6 +6658,7 @@
       <w:r>
         <w:t>/style.css</w:t>
       </w:r>
+      <w:bookmarkEnd w:id="12"/>
     </w:p>
     <w:tbl>
       <w:tblPr>
@@ -8700,14 +8765,14 @@
           <w:lang w:val="de-CH"/>
         </w:rPr>
       </w:pPr>
-      <w:bookmarkStart w:id="8" w:name="_Toc114757475"/>
+      <w:bookmarkStart w:id="13" w:name="_Toc114757475"/>
       <w:r>
         <w:rPr>
           <w:lang w:val="de-CH"/>
         </w:rPr>
         <w:t>Schritt 3 – Daten zur Datenbank schicken</w:t>
       </w:r>
-      <w:bookmarkEnd w:id="8"/>
+      <w:bookmarkEnd w:id="13"/>
     </w:p>
     <w:p>
       <w:pPr>
@@ -8733,7 +8798,7 @@
           <w:lang w:val="de-CH"/>
         </w:rPr>
       </w:pPr>
-      <w:bookmarkStart w:id="9" w:name="_Toc114757476"/>
+      <w:bookmarkStart w:id="14" w:name="_Toc114757476"/>
       <w:proofErr w:type="spellStart"/>
       <w:r>
         <w:rPr>
@@ -8741,7 +8806,7 @@
         </w:rPr>
         <w:t>db_connection.php</w:t>
       </w:r>
-      <w:bookmarkEnd w:id="9"/>
+      <w:bookmarkEnd w:id="14"/>
       <w:proofErr w:type="spellEnd"/>
     </w:p>
     <w:p>
@@ -8776,17 +8841,31 @@
         <w:pStyle w:val="Beschriftung"/>
         <w:keepNext/>
       </w:pPr>
+      <w:bookmarkStart w:id="15" w:name="_Toc114815365"/>
       <w:r>
         <w:t xml:space="preserve">Tabelle </w:t>
       </w:r>
-      <w:fldSimple w:instr=" SEQ Tabelle \* ARABIC ">
-        <w:r>
-          <w:rPr>
-            <w:noProof/>
-          </w:rPr>
-          <w:t>3</w:t>
-        </w:r>
-      </w:fldSimple>
+      <w:r>
+        <w:fldChar w:fldCharType="begin"/>
+      </w:r>
+      <w:r>
+        <w:instrText xml:space="preserve"> SEQ Tabelle \* ARABIC </w:instrText>
+      </w:r>
+      <w:r>
+        <w:fldChar w:fldCharType="separate"/>
+      </w:r>
+      <w:r>
+        <w:rPr>
+          <w:noProof/>
+        </w:rPr>
+        <w:t>3</w:t>
+      </w:r>
+      <w:r>
+        <w:rPr>
+          <w:noProof/>
+        </w:rPr>
+        <w:fldChar w:fldCharType="end"/>
+      </w:r>
       <w:r>
         <w:t xml:space="preserve">: </w:t>
       </w:r>
@@ -8794,6 +8873,7 @@
       <w:r>
         <w:t>db_connection.php</w:t>
       </w:r>
+      <w:bookmarkEnd w:id="15"/>
       <w:proofErr w:type="spellEnd"/>
     </w:p>
     <w:tbl>
@@ -9910,7 +9990,7 @@
           <w:lang w:val="de-CH"/>
         </w:rPr>
       </w:pPr>
-      <w:bookmarkStart w:id="10" w:name="_Toc114757477"/>
+      <w:bookmarkStart w:id="16" w:name="_Toc114757477"/>
       <w:proofErr w:type="spellStart"/>
       <w:r>
         <w:rPr>
@@ -9918,7 +9998,7 @@
         </w:rPr>
         <w:t>texteditor.sql</w:t>
       </w:r>
-      <w:bookmarkEnd w:id="10"/>
+      <w:bookmarkEnd w:id="16"/>
       <w:proofErr w:type="spellEnd"/>
     </w:p>
     <w:p>
@@ -9939,18 +10019,32 @@
         <w:pStyle w:val="Beschriftung"/>
         <w:keepNext/>
       </w:pPr>
+      <w:bookmarkStart w:id="17" w:name="_Toc114815366"/>
       <w:r>
         <w:lastRenderedPageBreak/>
         <w:t xml:space="preserve">Tabelle </w:t>
       </w:r>
-      <w:fldSimple w:instr=" SEQ Tabelle \* ARABIC ">
-        <w:r>
-          <w:rPr>
-            <w:noProof/>
-          </w:rPr>
-          <w:t>4</w:t>
-        </w:r>
-      </w:fldSimple>
+      <w:r>
+        <w:fldChar w:fldCharType="begin"/>
+      </w:r>
+      <w:r>
+        <w:instrText xml:space="preserve"> SEQ Tabelle \* ARABIC </w:instrText>
+      </w:r>
+      <w:r>
+        <w:fldChar w:fldCharType="separate"/>
+      </w:r>
+      <w:r>
+        <w:rPr>
+          <w:noProof/>
+        </w:rPr>
+        <w:t>4</w:t>
+      </w:r>
+      <w:r>
+        <w:rPr>
+          <w:noProof/>
+        </w:rPr>
+        <w:fldChar w:fldCharType="end"/>
+      </w:r>
       <w:r>
         <w:t xml:space="preserve">: </w:t>
       </w:r>
@@ -9958,6 +10052,7 @@
       <w:r>
         <w:t>texteditor.sql</w:t>
       </w:r>
+      <w:bookmarkEnd w:id="17"/>
       <w:proofErr w:type="spellEnd"/>
     </w:p>
     <w:tbl>
@@ -11137,7 +11232,7 @@
           <w:lang w:val="de-CH"/>
         </w:rPr>
       </w:pPr>
-      <w:bookmarkStart w:id="11" w:name="_Toc114757478"/>
+      <w:bookmarkStart w:id="18" w:name="_Toc114757478"/>
       <w:proofErr w:type="spellStart"/>
       <w:r>
         <w:rPr>
@@ -11145,7 +11240,7 @@
         </w:rPr>
         <w:t>process.php</w:t>
       </w:r>
-      <w:bookmarkEnd w:id="11"/>
+      <w:bookmarkEnd w:id="18"/>
       <w:proofErr w:type="spellEnd"/>
     </w:p>
     <w:p>
@@ -11178,17 +11273,31 @@
         <w:pStyle w:val="Beschriftung"/>
         <w:keepNext/>
       </w:pPr>
+      <w:bookmarkStart w:id="19" w:name="_Toc114815367"/>
       <w:r>
         <w:t xml:space="preserve">Tabelle </w:t>
       </w:r>
-      <w:fldSimple w:instr=" SEQ Tabelle \* ARABIC ">
-        <w:r>
-          <w:rPr>
-            <w:noProof/>
-          </w:rPr>
-          <w:t>5</w:t>
-        </w:r>
-      </w:fldSimple>
+      <w:r>
+        <w:fldChar w:fldCharType="begin"/>
+      </w:r>
+      <w:r>
+        <w:instrText xml:space="preserve"> SEQ Tabelle \* ARABIC </w:instrText>
+      </w:r>
+      <w:r>
+        <w:fldChar w:fldCharType="separate"/>
+      </w:r>
+      <w:r>
+        <w:rPr>
+          <w:noProof/>
+        </w:rPr>
+        <w:t>5</w:t>
+      </w:r>
+      <w:r>
+        <w:rPr>
+          <w:noProof/>
+        </w:rPr>
+        <w:fldChar w:fldCharType="end"/>
+      </w:r>
       <w:r>
         <w:t xml:space="preserve">: </w:t>
       </w:r>
@@ -11196,6 +11305,7 @@
       <w:r>
         <w:t>process.php</w:t>
       </w:r>
+      <w:bookmarkEnd w:id="19"/>
       <w:proofErr w:type="spellEnd"/>
     </w:p>
     <w:tbl>
@@ -13617,14 +13727,14 @@
           <w:lang w:val="de-CH"/>
         </w:rPr>
       </w:pPr>
-      <w:bookmarkStart w:id="12" w:name="_Toc114757479"/>
+      <w:bookmarkStart w:id="20" w:name="_Toc114757479"/>
       <w:r>
         <w:rPr>
           <w:lang w:val="de-CH"/>
         </w:rPr>
         <w:t>Schritt 4 – Daten holen und anzeigen</w:t>
       </w:r>
-      <w:bookmarkEnd w:id="12"/>
+      <w:bookmarkEnd w:id="20"/>
     </w:p>
     <w:p>
       <w:pPr>
@@ -13637,7 +13747,7 @@
           <w:lang w:val="de-CH"/>
         </w:rPr>
       </w:pPr>
-      <w:bookmarkStart w:id="13" w:name="_Toc114757480"/>
+      <w:bookmarkStart w:id="21" w:name="_Toc114757480"/>
       <w:proofErr w:type="spellStart"/>
       <w:r>
         <w:rPr>
@@ -13645,7 +13755,7 @@
         </w:rPr>
         <w:t>index.php</w:t>
       </w:r>
-      <w:bookmarkEnd w:id="13"/>
+      <w:bookmarkEnd w:id="21"/>
       <w:proofErr w:type="spellEnd"/>
     </w:p>
     <w:p>
@@ -13666,17 +13776,31 @@
         <w:pStyle w:val="Beschriftung"/>
         <w:keepNext/>
       </w:pPr>
+      <w:bookmarkStart w:id="22" w:name="_Toc114815368"/>
       <w:r>
         <w:t xml:space="preserve">Tabelle </w:t>
       </w:r>
-      <w:fldSimple w:instr=" SEQ Tabelle \* ARABIC ">
-        <w:r>
-          <w:rPr>
-            <w:noProof/>
-          </w:rPr>
-          <w:t>6</w:t>
-        </w:r>
-      </w:fldSimple>
+      <w:r>
+        <w:fldChar w:fldCharType="begin"/>
+      </w:r>
+      <w:r>
+        <w:instrText xml:space="preserve"> SEQ Tabelle \* ARABIC </w:instrText>
+      </w:r>
+      <w:r>
+        <w:fldChar w:fldCharType="separate"/>
+      </w:r>
+      <w:r>
+        <w:rPr>
+          <w:noProof/>
+        </w:rPr>
+        <w:t>6</w:t>
+      </w:r>
+      <w:r>
+        <w:rPr>
+          <w:noProof/>
+        </w:rPr>
+        <w:fldChar w:fldCharType="end"/>
+      </w:r>
       <w:r>
         <w:t xml:space="preserve">: </w:t>
       </w:r>
@@ -13684,6 +13808,7 @@
       <w:r>
         <w:t>index.php</w:t>
       </w:r>
+      <w:bookmarkEnd w:id="22"/>
       <w:proofErr w:type="spellEnd"/>
     </w:p>
     <w:tbl>
@@ -17779,7 +17904,7 @@
           <w:lang w:val="de-CH"/>
         </w:rPr>
       </w:pPr>
-      <w:bookmarkStart w:id="14" w:name="_Toc114757481"/>
+      <w:bookmarkStart w:id="23" w:name="_Toc114757481"/>
       <w:proofErr w:type="spellStart"/>
       <w:r>
         <w:rPr>
@@ -17788,7 +17913,7 @@
         <w:lastRenderedPageBreak/>
         <w:t>details.php</w:t>
       </w:r>
-      <w:bookmarkEnd w:id="14"/>
+      <w:bookmarkEnd w:id="23"/>
       <w:proofErr w:type="spellEnd"/>
     </w:p>
     <w:p>
@@ -17796,18 +17921,31 @@
         <w:pStyle w:val="Beschriftung"/>
         <w:keepNext/>
       </w:pPr>
-      <w:bookmarkStart w:id="15" w:name="_Toc114757344"/>
+      <w:bookmarkStart w:id="24" w:name="_Toc114815369"/>
       <w:r>
         <w:t xml:space="preserve">Tabelle </w:t>
       </w:r>
-      <w:fldSimple w:instr=" SEQ Tabelle \* ARABIC ">
-        <w:r>
-          <w:rPr>
-            <w:noProof/>
-          </w:rPr>
-          <w:t>7</w:t>
-        </w:r>
-      </w:fldSimple>
+      <w:r>
+        <w:fldChar w:fldCharType="begin"/>
+      </w:r>
+      <w:r>
+        <w:instrText xml:space="preserve"> SEQ Tabelle \* ARABIC </w:instrText>
+      </w:r>
+      <w:r>
+        <w:fldChar w:fldCharType="separate"/>
+      </w:r>
+      <w:r>
+        <w:rPr>
+          <w:noProof/>
+        </w:rPr>
+        <w:t>7</w:t>
+      </w:r>
+      <w:r>
+        <w:rPr>
+          <w:noProof/>
+        </w:rPr>
+        <w:fldChar w:fldCharType="end"/>
+      </w:r>
       <w:r>
         <w:t xml:space="preserve">: </w:t>
       </w:r>
@@ -17819,7 +17957,7 @@
       <w:r>
         <w:t>:</w:t>
       </w:r>
-      <w:bookmarkEnd w:id="15"/>
+      <w:bookmarkEnd w:id="24"/>
     </w:p>
     <w:tbl>
       <w:tblPr>
@@ -21743,6 +21881,860 @@
     </w:p>
     <w:p>
       <w:pPr>
+        <w:pStyle w:val="berschrift2"/>
+        <w:numPr>
+          <w:ilvl w:val="1"/>
+          <w:numId w:val="1"/>
+        </w:numPr>
+        <w:rPr>
+          <w:lang w:val="de-CH"/>
+        </w:rPr>
+      </w:pPr>
+      <w:r>
+        <w:rPr>
+          <w:lang w:val="de-CH"/>
+        </w:rPr>
+        <w:t>Schritt 5 – Steuerelemente definieren</w:t>
+      </w:r>
+    </w:p>
+    <w:p>
+      <w:pPr>
+        <w:rPr>
+          <w:lang w:val="de-CH"/>
+        </w:rPr>
+      </w:pPr>
+      <w:r>
+        <w:rPr>
+          <w:lang w:val="de-CH"/>
+        </w:rPr>
+        <w:t>Normalerweise werden nicht so viele Steuerelemente verwendet.</w:t>
+      </w:r>
+    </w:p>
+    <w:p>
+      <w:pPr>
+        <w:keepNext/>
+      </w:pPr>
+      <w:r>
+        <w:rPr>
+          <w:lang w:val="de-CH"/>
+        </w:rPr>
+        <w:drawing>
+          <wp:inline distT="0" distB="0" distL="0" distR="0" wp14:anchorId="10106A61" wp14:editId="7582E919">
+            <wp:extent cx="5760720" cy="684530"/>
+            <wp:effectExtent l="0" t="0" r="0" b="1270"/>
+            <wp:docPr id="6" name="Grafik 6"/>
+            <wp:cNvGraphicFramePr>
+              <a:graphicFrameLocks xmlns:a="http://schemas.openxmlformats.org/drawingml/2006/main" noChangeAspect="1"/>
+            </wp:cNvGraphicFramePr>
+            <a:graphic xmlns:a="http://schemas.openxmlformats.org/drawingml/2006/main">
+              <a:graphicData uri="http://schemas.openxmlformats.org/drawingml/2006/picture">
+                <pic:pic xmlns:pic="http://schemas.openxmlformats.org/drawingml/2006/picture">
+                  <pic:nvPicPr>
+                    <pic:cNvPr id="1" name=""/>
+                    <pic:cNvPicPr/>
+                  </pic:nvPicPr>
+                  <pic:blipFill>
+                    <a:blip r:embed="rId12"/>
+                    <a:stretch>
+                      <a:fillRect/>
+                    </a:stretch>
+                  </pic:blipFill>
+                  <pic:spPr>
+                    <a:xfrm>
+                      <a:off x="0" y="0"/>
+                      <a:ext cx="5760720" cy="684530"/>
+                    </a:xfrm>
+                    <a:prstGeom prst="rect">
+                      <a:avLst/>
+                    </a:prstGeom>
+                  </pic:spPr>
+                </pic:pic>
+              </a:graphicData>
+            </a:graphic>
+          </wp:inline>
+        </w:drawing>
+      </w:r>
+    </w:p>
+    <w:p>
+      <w:pPr>
+        <w:pStyle w:val="Beschriftung"/>
+      </w:pPr>
+      <w:bookmarkStart w:id="25" w:name="_Toc114815355"/>
+      <w:r>
+        <w:t xml:space="preserve">Abbildung </w:t>
+      </w:r>
+      <w:fldSimple w:instr=" SEQ Abbildung \* ARABIC ">
+        <w:r>
+          <w:rPr>
+            <w:noProof/>
+          </w:rPr>
+          <w:t>6</w:t>
+        </w:r>
+      </w:fldSimple>
+      <w:r>
+        <w:t>: Steuerelemente</w:t>
+      </w:r>
+      <w:bookmarkEnd w:id="25"/>
+    </w:p>
+    <w:p>
+      <w:pPr>
+        <w:rPr>
+          <w:lang w:val="de-CH"/>
+        </w:rPr>
+      </w:pPr>
+      <w:r>
+        <w:rPr>
+          <w:lang w:val="de-CH"/>
+        </w:rPr>
+        <w:br w:type="page"/>
+      </w:r>
+    </w:p>
+    <w:p>
+      <w:pPr>
+        <w:rPr>
+          <w:lang w:val="de-CH"/>
+        </w:rPr>
+      </w:pPr>
+      <w:r>
+        <w:rPr>
+          <w:lang w:val="de-CH"/>
+        </w:rPr>
+        <w:lastRenderedPageBreak/>
+        <w:t xml:space="preserve">Um </w:t>
+      </w:r>
+      <w:r>
+        <w:rPr>
+          <w:lang w:val="de-CH"/>
+        </w:rPr>
+        <w:t>selbst</w:t>
+      </w:r>
+      <w:r>
+        <w:rPr>
+          <w:lang w:val="de-CH"/>
+        </w:rPr>
+        <w:t xml:space="preserve"> entscheiden zu können, welche Steuerelemente man verwenden möchte, kann man sie hier definieren.</w:t>
+      </w:r>
+    </w:p>
+    <w:p>
+      <w:pPr>
+        <w:rPr>
+          <w:lang w:val="de-CH"/>
+        </w:rPr>
+      </w:pPr>
+      <w:r>
+        <w:rPr>
+          <w:lang w:val="de-CH"/>
+        </w:rPr>
+        <w:t>Das File findet man im Projektordner unter dem «</w:t>
+      </w:r>
+      <w:proofErr w:type="spellStart"/>
+      <w:r>
+        <w:rPr>
+          <w:lang w:val="de-CH"/>
+        </w:rPr>
+        <w:t>ckeditor</w:t>
+      </w:r>
+      <w:proofErr w:type="spellEnd"/>
+      <w:r>
+        <w:rPr>
+          <w:lang w:val="de-CH"/>
+        </w:rPr>
+        <w:t>» und dann «build-config.js».</w:t>
+      </w:r>
+    </w:p>
+    <w:p>
+      <w:pPr>
+        <w:keepNext/>
+      </w:pPr>
+      <w:r>
+        <w:rPr>
+          <w:lang w:val="de-CH"/>
+        </w:rPr>
+        <w:lastRenderedPageBreak/>
+        <w:drawing>
+          <wp:inline distT="0" distB="0" distL="0" distR="0" wp14:anchorId="08A3818D" wp14:editId="03ADB107">
+            <wp:extent cx="2638793" cy="8211696"/>
+            <wp:effectExtent l="0" t="0" r="9525" b="0"/>
+            <wp:docPr id="7" name="Grafik 7"/>
+            <wp:cNvGraphicFramePr>
+              <a:graphicFrameLocks xmlns:a="http://schemas.openxmlformats.org/drawingml/2006/main" noChangeAspect="1"/>
+            </wp:cNvGraphicFramePr>
+            <a:graphic xmlns:a="http://schemas.openxmlformats.org/drawingml/2006/main">
+              <a:graphicData uri="http://schemas.openxmlformats.org/drawingml/2006/picture">
+                <pic:pic xmlns:pic="http://schemas.openxmlformats.org/drawingml/2006/picture">
+                  <pic:nvPicPr>
+                    <pic:cNvPr id="1" name=""/>
+                    <pic:cNvPicPr/>
+                  </pic:nvPicPr>
+                  <pic:blipFill>
+                    <a:blip r:embed="rId13"/>
+                    <a:stretch>
+                      <a:fillRect/>
+                    </a:stretch>
+                  </pic:blipFill>
+                  <pic:spPr>
+                    <a:xfrm>
+                      <a:off x="0" y="0"/>
+                      <a:ext cx="2638793" cy="8211696"/>
+                    </a:xfrm>
+                    <a:prstGeom prst="rect">
+                      <a:avLst/>
+                    </a:prstGeom>
+                  </pic:spPr>
+                </pic:pic>
+              </a:graphicData>
+            </a:graphic>
+          </wp:inline>
+        </w:drawing>
+      </w:r>
+    </w:p>
+    <w:p>
+      <w:pPr>
+        <w:pStyle w:val="Beschriftung"/>
+        <w:rPr>
+          <w:lang w:val="de-CH"/>
+        </w:rPr>
+      </w:pPr>
+      <w:bookmarkStart w:id="26" w:name="_Toc114815356"/>
+      <w:r>
+        <w:t xml:space="preserve">Abbildung </w:t>
+      </w:r>
+      <w:fldSimple w:instr=" SEQ Abbildung \* ARABIC ">
+        <w:r>
+          <w:rPr>
+            <w:noProof/>
+          </w:rPr>
+          <w:t>7</w:t>
+        </w:r>
+      </w:fldSimple>
+      <w:r>
+        <w:t>: Originalversion des Bereichs "</w:t>
+      </w:r>
+      <w:proofErr w:type="spellStart"/>
+      <w:r>
+        <w:t>plugins</w:t>
+      </w:r>
+      <w:proofErr w:type="spellEnd"/>
+      <w:r>
+        <w:t>"</w:t>
+      </w:r>
+      <w:bookmarkEnd w:id="26"/>
+    </w:p>
+    <w:p>
+      <w:pPr>
+        <w:rPr>
+          <w:lang w:val="de-CH"/>
+        </w:rPr>
+      </w:pPr>
+      <w:r>
+        <w:rPr>
+          <w:lang w:val="de-CH"/>
+        </w:rPr>
+        <w:t>Danach könnte man das File so anpassen, dass man nur 4 Elemente auswählt:</w:t>
+      </w:r>
+    </w:p>
+    <w:p>
+      <w:pPr>
+        <w:keepNext/>
+      </w:pPr>
+      <w:r>
+        <w:rPr>
+          <w:lang w:val="de-CH"/>
+        </w:rPr>
+        <w:lastRenderedPageBreak/>
+        <w:drawing>
+          <wp:inline distT="0" distB="0" distL="0" distR="0" wp14:anchorId="5E518020" wp14:editId="77AD472E">
+            <wp:extent cx="1305107" cy="905001"/>
+            <wp:effectExtent l="0" t="0" r="9525" b="9525"/>
+            <wp:docPr id="9" name="Grafik 9"/>
+            <wp:cNvGraphicFramePr>
+              <a:graphicFrameLocks xmlns:a="http://schemas.openxmlformats.org/drawingml/2006/main" noChangeAspect="1"/>
+            </wp:cNvGraphicFramePr>
+            <a:graphic xmlns:a="http://schemas.openxmlformats.org/drawingml/2006/main">
+              <a:graphicData uri="http://schemas.openxmlformats.org/drawingml/2006/picture">
+                <pic:pic xmlns:pic="http://schemas.openxmlformats.org/drawingml/2006/picture">
+                  <pic:nvPicPr>
+                    <pic:cNvPr id="1" name=""/>
+                    <pic:cNvPicPr/>
+                  </pic:nvPicPr>
+                  <pic:blipFill>
+                    <a:blip r:embed="rId14"/>
+                    <a:stretch>
+                      <a:fillRect/>
+                    </a:stretch>
+                  </pic:blipFill>
+                  <pic:spPr>
+                    <a:xfrm>
+                      <a:off x="0" y="0"/>
+                      <a:ext cx="1305107" cy="905001"/>
+                    </a:xfrm>
+                    <a:prstGeom prst="rect">
+                      <a:avLst/>
+                    </a:prstGeom>
+                  </pic:spPr>
+                </pic:pic>
+              </a:graphicData>
+            </a:graphic>
+          </wp:inline>
+        </w:drawing>
+      </w:r>
+    </w:p>
+    <w:p>
+      <w:pPr>
+        <w:pStyle w:val="Beschriftung"/>
+        <w:rPr>
+          <w:lang w:val="de-CH"/>
+        </w:rPr>
+      </w:pPr>
+      <w:bookmarkStart w:id="27" w:name="_Toc114815357"/>
+      <w:r>
+        <w:t xml:space="preserve">Abbildung </w:t>
+      </w:r>
+      <w:fldSimple w:instr=" SEQ Abbildung \* ARABIC ">
+        <w:r>
+          <w:rPr>
+            <w:noProof/>
+          </w:rPr>
+          <w:t>8</w:t>
+        </w:r>
+      </w:fldSimple>
+      <w:r>
+        <w:t>: Für das Beispiel abgeänderte File im Bereich "</w:t>
+      </w:r>
+      <w:proofErr w:type="spellStart"/>
+      <w:r>
+        <w:t>plugins</w:t>
+      </w:r>
+      <w:proofErr w:type="spellEnd"/>
+      <w:r>
+        <w:t>"</w:t>
+      </w:r>
+      <w:bookmarkEnd w:id="27"/>
+    </w:p>
+    <w:p>
+      <w:pPr>
+        <w:rPr>
+          <w:lang w:val="de-CH"/>
+        </w:rPr>
+      </w:pPr>
+      <w:r>
+        <w:rPr>
+          <w:lang w:val="de-CH"/>
+        </w:rPr>
+        <w:t xml:space="preserve">Nun muss man dieses File, in welchem man die Plugins geändert hat auf dieser </w:t>
+      </w:r>
+      <w:hyperlink r:id="rId15" w:history="1">
+        <w:r>
+          <w:rPr>
+            <w:rStyle w:val="Hyperlink"/>
+            <w:lang w:val="de-CH"/>
+          </w:rPr>
+          <w:t>Webseite</w:t>
+        </w:r>
+      </w:hyperlink>
+      <w:r>
+        <w:rPr>
+          <w:lang w:val="de-CH"/>
+        </w:rPr>
+        <w:t xml:space="preserve"> hochladen!</w:t>
+      </w:r>
+    </w:p>
+    <w:p>
+      <w:pPr>
+        <w:rPr>
+          <w:lang w:val="de-CH"/>
+        </w:rPr>
+      </w:pPr>
+      <w:r>
+        <w:rPr>
+          <w:lang w:val="de-CH"/>
+        </w:rPr>
+        <w:t>Dabei muss man beachten, dass man hier auch wieder die «</w:t>
+      </w:r>
+      <w:proofErr w:type="spellStart"/>
+      <w:r>
+        <w:rPr>
+          <w:lang w:val="de-CH"/>
+        </w:rPr>
+        <w:t>Full</w:t>
+      </w:r>
+      <w:proofErr w:type="spellEnd"/>
+      <w:r>
+        <w:rPr>
+          <w:lang w:val="de-CH"/>
+        </w:rPr>
+        <w:t>» Version auswählt.</w:t>
+      </w:r>
+    </w:p>
+    <w:p>
+      <w:pPr>
+        <w:keepNext/>
+      </w:pPr>
+      <w:r>
+        <w:rPr>
+          <w:lang w:val="de-CH"/>
+        </w:rPr>
+        <w:drawing>
+          <wp:inline distT="0" distB="0" distL="0" distR="0" wp14:anchorId="6EDCFCF4" wp14:editId="0487BEA3">
+            <wp:extent cx="5760720" cy="1569085"/>
+            <wp:effectExtent l="0" t="0" r="0" b="0"/>
+            <wp:docPr id="11" name="Grafik 11"/>
+            <wp:cNvGraphicFramePr>
+              <a:graphicFrameLocks xmlns:a="http://schemas.openxmlformats.org/drawingml/2006/main" noChangeAspect="1"/>
+            </wp:cNvGraphicFramePr>
+            <a:graphic xmlns:a="http://schemas.openxmlformats.org/drawingml/2006/main">
+              <a:graphicData uri="http://schemas.openxmlformats.org/drawingml/2006/picture">
+                <pic:pic xmlns:pic="http://schemas.openxmlformats.org/drawingml/2006/picture">
+                  <pic:nvPicPr>
+                    <pic:cNvPr id="1" name=""/>
+                    <pic:cNvPicPr/>
+                  </pic:nvPicPr>
+                  <pic:blipFill>
+                    <a:blip r:embed="rId16"/>
+                    <a:stretch>
+                      <a:fillRect/>
+                    </a:stretch>
+                  </pic:blipFill>
+                  <pic:spPr>
+                    <a:xfrm>
+                      <a:off x="0" y="0"/>
+                      <a:ext cx="5760720" cy="1569085"/>
+                    </a:xfrm>
+                    <a:prstGeom prst="rect">
+                      <a:avLst/>
+                    </a:prstGeom>
+                  </pic:spPr>
+                </pic:pic>
+              </a:graphicData>
+            </a:graphic>
+          </wp:inline>
+        </w:drawing>
+      </w:r>
+    </w:p>
+    <w:p>
+      <w:pPr>
+        <w:pStyle w:val="Beschriftung"/>
+        <w:rPr>
+          <w:lang w:val="de-CH"/>
+        </w:rPr>
+      </w:pPr>
+      <w:bookmarkStart w:id="28" w:name="_Toc114815358"/>
+      <w:r>
+        <w:t xml:space="preserve">Abbildung </w:t>
+      </w:r>
+      <w:fldSimple w:instr=" SEQ Abbildung \* ARABIC ">
+        <w:r>
+          <w:rPr>
+            <w:noProof/>
+          </w:rPr>
+          <w:t>9</w:t>
+        </w:r>
+      </w:fldSimple>
+      <w:r>
+        <w:t>: Auswahl der Version</w:t>
+      </w:r>
+      <w:bookmarkEnd w:id="28"/>
+    </w:p>
+    <w:p>
+      <w:pPr>
+        <w:rPr>
+          <w:lang w:val="de-CH"/>
+        </w:rPr>
+      </w:pPr>
+      <w:r>
+        <w:rPr>
+          <w:lang w:val="de-CH"/>
+        </w:rPr>
+        <w:t>Dann kann man hier sehen, welche Plugins darin enthalten sind.</w:t>
+      </w:r>
+    </w:p>
+    <w:p>
+      <w:pPr>
+        <w:keepNext/>
+      </w:pPr>
+      <w:r>
+        <w:rPr>
+          <w:lang w:val="de-CH"/>
+        </w:rPr>
+        <w:drawing>
+          <wp:inline distT="0" distB="0" distL="0" distR="0" wp14:anchorId="72A7D959" wp14:editId="326349CB">
+            <wp:extent cx="5760720" cy="3703320"/>
+            <wp:effectExtent l="0" t="0" r="0" b="0"/>
+            <wp:docPr id="12" name="Grafik 12"/>
+            <wp:cNvGraphicFramePr>
+              <a:graphicFrameLocks xmlns:a="http://schemas.openxmlformats.org/drawingml/2006/main" noChangeAspect="1"/>
+            </wp:cNvGraphicFramePr>
+            <a:graphic xmlns:a="http://schemas.openxmlformats.org/drawingml/2006/main">
+              <a:graphicData uri="http://schemas.openxmlformats.org/drawingml/2006/picture">
+                <pic:pic xmlns:pic="http://schemas.openxmlformats.org/drawingml/2006/picture">
+                  <pic:nvPicPr>
+                    <pic:cNvPr id="1" name=""/>
+                    <pic:cNvPicPr/>
+                  </pic:nvPicPr>
+                  <pic:blipFill>
+                    <a:blip r:embed="rId17"/>
+                    <a:stretch>
+                      <a:fillRect/>
+                    </a:stretch>
+                  </pic:blipFill>
+                  <pic:spPr>
+                    <a:xfrm>
+                      <a:off x="0" y="0"/>
+                      <a:ext cx="5760720" cy="3703320"/>
+                    </a:xfrm>
+                    <a:prstGeom prst="rect">
+                      <a:avLst/>
+                    </a:prstGeom>
+                  </pic:spPr>
+                </pic:pic>
+              </a:graphicData>
+            </a:graphic>
+          </wp:inline>
+        </w:drawing>
+      </w:r>
+    </w:p>
+    <w:p>
+      <w:pPr>
+        <w:pStyle w:val="Beschriftung"/>
+        <w:rPr>
+          <w:lang w:val="de-CH"/>
+        </w:rPr>
+      </w:pPr>
+      <w:bookmarkStart w:id="29" w:name="_Toc114815359"/>
+      <w:r>
+        <w:t xml:space="preserve">Abbildung </w:t>
+      </w:r>
+      <w:fldSimple w:instr=" SEQ Abbildung \* ARABIC ">
+        <w:r>
+          <w:rPr>
+            <w:noProof/>
+          </w:rPr>
+          <w:t>10</w:t>
+        </w:r>
+      </w:fldSimple>
+      <w:r>
+        <w:t>: Übersicht von den Plugins, die enthalten sind</w:t>
+      </w:r>
+      <w:bookmarkEnd w:id="29"/>
+    </w:p>
+    <w:p>
+      <w:pPr>
+        <w:rPr>
+          <w:lang w:val="de-CH"/>
+        </w:rPr>
+      </w:pPr>
+      <w:r>
+        <w:rPr>
+          <w:lang w:val="de-CH"/>
+        </w:rPr>
+        <w:t>Hier kann man noch den Stil auswählen. Hier wird «</w:t>
+      </w:r>
+      <w:proofErr w:type="spellStart"/>
+      <w:r>
+        <w:rPr>
+          <w:lang w:val="de-CH"/>
+        </w:rPr>
+        <w:t>Moono</w:t>
+      </w:r>
+      <w:proofErr w:type="spellEnd"/>
+      <w:r>
+        <w:rPr>
+          <w:lang w:val="de-CH"/>
+        </w:rPr>
+        <w:t>-Lisa» verwendet.</w:t>
+      </w:r>
+    </w:p>
+    <w:p>
+      <w:pPr>
+        <w:keepNext/>
+      </w:pPr>
+      <w:r>
+        <w:rPr>
+          <w:lang w:val="de-CH"/>
+        </w:rPr>
+        <w:lastRenderedPageBreak/>
+        <w:drawing>
+          <wp:inline distT="0" distB="0" distL="0" distR="0" wp14:anchorId="2CD208D6" wp14:editId="78BB423A">
+            <wp:extent cx="5760720" cy="1163320"/>
+            <wp:effectExtent l="0" t="0" r="0" b="0"/>
+            <wp:docPr id="13" name="Grafik 13"/>
+            <wp:cNvGraphicFramePr>
+              <a:graphicFrameLocks xmlns:a="http://schemas.openxmlformats.org/drawingml/2006/main" noChangeAspect="1"/>
+            </wp:cNvGraphicFramePr>
+            <a:graphic xmlns:a="http://schemas.openxmlformats.org/drawingml/2006/main">
+              <a:graphicData uri="http://schemas.openxmlformats.org/drawingml/2006/picture">
+                <pic:pic xmlns:pic="http://schemas.openxmlformats.org/drawingml/2006/picture">
+                  <pic:nvPicPr>
+                    <pic:cNvPr id="1" name=""/>
+                    <pic:cNvPicPr/>
+                  </pic:nvPicPr>
+                  <pic:blipFill>
+                    <a:blip r:embed="rId18"/>
+                    <a:stretch>
+                      <a:fillRect/>
+                    </a:stretch>
+                  </pic:blipFill>
+                  <pic:spPr>
+                    <a:xfrm>
+                      <a:off x="0" y="0"/>
+                      <a:ext cx="5760720" cy="1163320"/>
+                    </a:xfrm>
+                    <a:prstGeom prst="rect">
+                      <a:avLst/>
+                    </a:prstGeom>
+                  </pic:spPr>
+                </pic:pic>
+              </a:graphicData>
+            </a:graphic>
+          </wp:inline>
+        </w:drawing>
+      </w:r>
+    </w:p>
+    <w:p>
+      <w:pPr>
+        <w:pStyle w:val="Beschriftung"/>
+        <w:rPr>
+          <w:lang w:val="de-CH"/>
+        </w:rPr>
+      </w:pPr>
+      <w:bookmarkStart w:id="30" w:name="_Toc114815360"/>
+      <w:r>
+        <w:t xml:space="preserve">Abbildung </w:t>
+      </w:r>
+      <w:fldSimple w:instr=" SEQ Abbildung \* ARABIC ">
+        <w:r>
+          <w:rPr>
+            <w:noProof/>
+          </w:rPr>
+          <w:t>11</w:t>
+        </w:r>
+      </w:fldSimple>
+      <w:r>
+        <w:t>: Den Skin des Texteditor-Manipulators ändern</w:t>
+      </w:r>
+      <w:bookmarkEnd w:id="30"/>
+    </w:p>
+    <w:p>
+      <w:pPr>
+        <w:rPr>
+          <w:lang w:val="de-CH"/>
+        </w:rPr>
+      </w:pPr>
+      <w:r>
+        <w:rPr>
+          <w:lang w:val="de-CH"/>
+        </w:rPr>
+        <w:t xml:space="preserve">Nun kann man noch die Sprache auswählen und dann auf «Download </w:t>
+      </w:r>
+      <w:proofErr w:type="spellStart"/>
+      <w:r>
+        <w:rPr>
+          <w:lang w:val="de-CH"/>
+        </w:rPr>
+        <w:t>CKEditor</w:t>
+      </w:r>
+      <w:proofErr w:type="spellEnd"/>
+      <w:r>
+        <w:rPr>
+          <w:lang w:val="de-CH"/>
+        </w:rPr>
+        <w:t xml:space="preserve"> 4.19.1». Kann auch sein, dass eine andere Version draufsteht. Soll genau gleich funktionieren.</w:t>
+      </w:r>
+    </w:p>
+    <w:p>
+      <w:pPr>
+        <w:keepNext/>
+      </w:pPr>
+      <w:r>
+        <w:rPr>
+          <w:lang w:val="de-CH"/>
+        </w:rPr>
+        <w:drawing>
+          <wp:inline distT="0" distB="0" distL="0" distR="0" wp14:anchorId="4B3281CD" wp14:editId="2D80F974">
+            <wp:extent cx="5760720" cy="3836670"/>
+            <wp:effectExtent l="0" t="0" r="0" b="0"/>
+            <wp:docPr id="14" name="Grafik 14"/>
+            <wp:cNvGraphicFramePr>
+              <a:graphicFrameLocks xmlns:a="http://schemas.openxmlformats.org/drawingml/2006/main" noChangeAspect="1"/>
+            </wp:cNvGraphicFramePr>
+            <a:graphic xmlns:a="http://schemas.openxmlformats.org/drawingml/2006/main">
+              <a:graphicData uri="http://schemas.openxmlformats.org/drawingml/2006/picture">
+                <pic:pic xmlns:pic="http://schemas.openxmlformats.org/drawingml/2006/picture">
+                  <pic:nvPicPr>
+                    <pic:cNvPr id="1" name=""/>
+                    <pic:cNvPicPr/>
+                  </pic:nvPicPr>
+                  <pic:blipFill>
+                    <a:blip r:embed="rId19"/>
+                    <a:stretch>
+                      <a:fillRect/>
+                    </a:stretch>
+                  </pic:blipFill>
+                  <pic:spPr>
+                    <a:xfrm>
+                      <a:off x="0" y="0"/>
+                      <a:ext cx="5760720" cy="3836670"/>
+                    </a:xfrm>
+                    <a:prstGeom prst="rect">
+                      <a:avLst/>
+                    </a:prstGeom>
+                  </pic:spPr>
+                </pic:pic>
+              </a:graphicData>
+            </a:graphic>
+          </wp:inline>
+        </w:drawing>
+      </w:r>
+    </w:p>
+    <w:p>
+      <w:pPr>
+        <w:pStyle w:val="Beschriftung"/>
+        <w:rPr>
+          <w:lang w:val="de-CH"/>
+        </w:rPr>
+      </w:pPr>
+      <w:bookmarkStart w:id="31" w:name="_Toc114815361"/>
+      <w:r>
+        <w:t xml:space="preserve">Abbildung </w:t>
+      </w:r>
+      <w:fldSimple w:instr=" SEQ Abbildung \* ARABIC ">
+        <w:r>
+          <w:rPr>
+            <w:noProof/>
+          </w:rPr>
+          <w:t>12</w:t>
+        </w:r>
+      </w:fldSimple>
+      <w:r>
+        <w:t>: Sprache auswählen und herunterladen</w:t>
+      </w:r>
+      <w:bookmarkEnd w:id="31"/>
+    </w:p>
+    <w:p>
+      <w:pPr>
+        <w:rPr>
+          <w:lang w:val="de-CH"/>
+        </w:rPr>
+      </w:pPr>
+      <w:r>
+        <w:rPr>
+          <w:lang w:val="de-CH"/>
+        </w:rPr>
+        <w:t>Hat man den Ordner herunterladen, müssen die darin enthaltenen Files, mit den Files ersetzt werden, die schon im Ordner «</w:t>
+      </w:r>
+      <w:proofErr w:type="spellStart"/>
+      <w:r>
+        <w:rPr>
+          <w:lang w:val="de-CH"/>
+        </w:rPr>
+        <w:t>ckeditor</w:t>
+      </w:r>
+      <w:proofErr w:type="spellEnd"/>
+      <w:r>
+        <w:rPr>
+          <w:lang w:val="de-CH"/>
+        </w:rPr>
+        <w:t>» im Projektordner enthalten sind.</w:t>
+      </w:r>
+    </w:p>
+    <w:p>
+      <w:pPr>
+        <w:rPr>
+          <w:lang w:val="de-CH"/>
+        </w:rPr>
+      </w:pPr>
+      <w:r>
+        <w:rPr>
+          <w:lang w:val="de-CH"/>
+        </w:rPr>
+        <w:t>Hat man das gemacht, soll es am Ende so aussehen, wenn man der Anleitung gefolgt ist:</w:t>
+      </w:r>
+    </w:p>
+    <w:p>
+      <w:pPr>
+        <w:keepNext/>
+      </w:pPr>
+      <w:r>
+        <w:rPr>
+          <w:lang w:val="de-CH"/>
+        </w:rPr>
+        <w:drawing>
+          <wp:inline distT="0" distB="0" distL="0" distR="0" wp14:anchorId="0A124396" wp14:editId="361B7B0B">
+            <wp:extent cx="5760720" cy="1552575"/>
+            <wp:effectExtent l="0" t="0" r="0" b="9525"/>
+            <wp:docPr id="15" name="Grafik 15"/>
+            <wp:cNvGraphicFramePr>
+              <a:graphicFrameLocks xmlns:a="http://schemas.openxmlformats.org/drawingml/2006/main" noChangeAspect="1"/>
+            </wp:cNvGraphicFramePr>
+            <a:graphic xmlns:a="http://schemas.openxmlformats.org/drawingml/2006/main">
+              <a:graphicData uri="http://schemas.openxmlformats.org/drawingml/2006/picture">
+                <pic:pic xmlns:pic="http://schemas.openxmlformats.org/drawingml/2006/picture">
+                  <pic:nvPicPr>
+                    <pic:cNvPr id="1" name=""/>
+                    <pic:cNvPicPr/>
+                  </pic:nvPicPr>
+                  <pic:blipFill>
+                    <a:blip r:embed="rId20"/>
+                    <a:stretch>
+                      <a:fillRect/>
+                    </a:stretch>
+                  </pic:blipFill>
+                  <pic:spPr>
+                    <a:xfrm>
+                      <a:off x="0" y="0"/>
+                      <a:ext cx="5760720" cy="1552575"/>
+                    </a:xfrm>
+                    <a:prstGeom prst="rect">
+                      <a:avLst/>
+                    </a:prstGeom>
+                  </pic:spPr>
+                </pic:pic>
+              </a:graphicData>
+            </a:graphic>
+          </wp:inline>
+        </w:drawing>
+      </w:r>
+    </w:p>
+    <w:p>
+      <w:pPr>
+        <w:pStyle w:val="Beschriftung"/>
+        <w:rPr>
+          <w:lang w:val="de-CH"/>
+        </w:rPr>
+      </w:pPr>
+      <w:bookmarkStart w:id="32" w:name="_Toc114815362"/>
+      <w:r>
+        <w:t xml:space="preserve">Abbildung </w:t>
+      </w:r>
+      <w:fldSimple w:instr=" SEQ Abbildung \* ARABIC ">
+        <w:r>
+          <w:rPr>
+            <w:noProof/>
+          </w:rPr>
+          <w:t>13</w:t>
+        </w:r>
+      </w:fldSimple>
+      <w:r>
+        <w:t>: Anzeige der Veränderung</w:t>
+      </w:r>
+      <w:bookmarkEnd w:id="32"/>
+    </w:p>
+    <w:p>
+      <w:pPr>
+        <w:rPr>
+          <w:lang w:val="de-CH"/>
+        </w:rPr>
+      </w:pPr>
+      <w:r>
+        <w:rPr>
+          <w:lang w:val="de-CH"/>
+        </w:rPr>
+        <w:lastRenderedPageBreak/>
+        <w:t>Hier sind zwar 5 Funktionen enthalten. Vermutet wird, dass eine Funktion als Standard immer mit integriert wird.</w:t>
+      </w:r>
+    </w:p>
+    <w:p>
+      <w:pPr>
         <w:pStyle w:val="berschrift1"/>
         <w:numPr>
           <w:ilvl w:val="0"/>
@@ -21752,14 +22744,14 @@
           <w:lang w:val="de-CH"/>
         </w:rPr>
       </w:pPr>
-      <w:bookmarkStart w:id="16" w:name="_Toc114757482"/>
+      <w:bookmarkStart w:id="33" w:name="_Toc114757482"/>
       <w:r>
         <w:rPr>
           <w:lang w:val="de-CH"/>
         </w:rPr>
         <w:t>Quellen</w:t>
       </w:r>
-      <w:bookmarkEnd w:id="16"/>
+      <w:bookmarkEnd w:id="33"/>
     </w:p>
     <w:tbl>
       <w:tblPr>
@@ -21831,7 +22823,7 @@
                 <w:lang w:val="de-CH"/>
               </w:rPr>
             </w:pPr>
-            <w:hyperlink r:id="rId12" w:history="1">
+            <w:hyperlink r:id="rId21" w:history="1">
               <w:r>
                 <w:rPr>
                   <w:rStyle w:val="Hyperlink"/>
@@ -21883,7 +22875,7 @@
                 <w:lang w:val="de-CH"/>
               </w:rPr>
             </w:pPr>
-            <w:hyperlink r:id="rId13" w:history="1">
+            <w:hyperlink r:id="rId22" w:history="1">
               <w:r>
                 <w:rPr>
                   <w:rStyle w:val="Hyperlink"/>
@@ -21954,14 +22946,14 @@
           <w:lang w:val="de-CH"/>
         </w:rPr>
       </w:pPr>
-      <w:bookmarkStart w:id="17" w:name="_Toc114757483"/>
+      <w:bookmarkStart w:id="34" w:name="_Toc114757483"/>
       <w:r>
         <w:rPr>
           <w:lang w:val="de-CH"/>
         </w:rPr>
         <w:t>Abbildungsverzeichnis</w:t>
       </w:r>
-      <w:bookmarkEnd w:id="17"/>
+      <w:bookmarkEnd w:id="34"/>
     </w:p>
     <w:p>
       <w:pPr>
@@ -21970,29 +22962,30 @@
           <w:tab w:val="right" w:leader="dot" w:pos="9062"/>
         </w:tabs>
         <w:rPr>
+          <w:rFonts w:eastAsiaTheme="minorEastAsia"/>
           <w:noProof/>
+          <w:lang w:eastAsia="de-DE"/>
+        </w:rPr>
+      </w:pPr>
+      <w:r>
+        <w:rPr>
           <w:lang w:val="de-CH"/>
         </w:rPr>
-      </w:pPr>
+        <w:fldChar w:fldCharType="begin"/>
+      </w:r>
       <w:r>
         <w:rPr>
           <w:lang w:val="de-CH"/>
         </w:rPr>
-        <w:fldChar w:fldCharType="begin"/>
+        <w:instrText xml:space="preserve"> TOC \h \z \c "Abbildung" </w:instrText>
       </w:r>
       <w:r>
         <w:rPr>
           <w:lang w:val="de-CH"/>
         </w:rPr>
-        <w:instrText xml:space="preserve"> TOC \h \z \c "Abbildung" </w:instrText>
-      </w:r>
-      <w:r>
-        <w:rPr>
-          <w:lang w:val="de-CH"/>
-        </w:rPr>
         <w:fldChar w:fldCharType="separate"/>
       </w:r>
-      <w:hyperlink w:anchor="_Toc114749717" w:history="1">
+      <w:hyperlink w:anchor="_Toc114815350" w:history="1">
         <w:r>
           <w:rPr>
             <w:rStyle w:val="Hyperlink"/>
@@ -22000,204 +22993,6 @@
             <w:lang w:val="de-CH"/>
           </w:rPr>
           <w:t>Abbildung 1: Wie ein Texteditor aussehen kann</w:t>
-        </w:r>
-        <w:r>
-          <w:rPr>
-            <w:noProof/>
-            <w:webHidden/>
-            <w:lang w:val="de-CH"/>
-          </w:rPr>
-          <w:tab/>
-        </w:r>
-        <w:r>
-          <w:rPr>
-            <w:noProof/>
-            <w:webHidden/>
-            <w:lang w:val="de-CH"/>
-          </w:rPr>
-          <w:fldChar w:fldCharType="begin"/>
-        </w:r>
-        <w:r>
-          <w:rPr>
-            <w:noProof/>
-            <w:webHidden/>
-            <w:lang w:val="de-CH"/>
-          </w:rPr>
-          <w:instrText xml:space="preserve"> PAGEREF _Toc114749717 \h </w:instrText>
-        </w:r>
-        <w:r>
-          <w:rPr>
-            <w:noProof/>
-            <w:webHidden/>
-            <w:lang w:val="de-CH"/>
-          </w:rPr>
-        </w:r>
-        <w:r>
-          <w:rPr>
-            <w:noProof/>
-            <w:webHidden/>
-            <w:lang w:val="de-CH"/>
-          </w:rPr>
-          <w:fldChar w:fldCharType="separate"/>
-        </w:r>
-        <w:r>
-          <w:rPr>
-            <w:noProof/>
-            <w:webHidden/>
-            <w:lang w:val="de-CH"/>
-          </w:rPr>
-          <w:t>1</w:t>
-        </w:r>
-        <w:r>
-          <w:rPr>
-            <w:noProof/>
-            <w:webHidden/>
-            <w:lang w:val="de-CH"/>
-          </w:rPr>
-          <w:fldChar w:fldCharType="end"/>
-        </w:r>
-      </w:hyperlink>
-    </w:p>
-    <w:p>
-      <w:pPr>
-        <w:pStyle w:val="Abbildungsverzeichnis"/>
-        <w:tabs>
-          <w:tab w:val="right" w:leader="dot" w:pos="9062"/>
-        </w:tabs>
-        <w:rPr>
-          <w:noProof/>
-          <w:lang w:val="de-CH"/>
-        </w:rPr>
-      </w:pPr>
-      <w:hyperlink w:anchor="_Toc114749718" w:history="1">
-        <w:r>
-          <w:rPr>
-            <w:rStyle w:val="Hyperlink"/>
-            <w:noProof/>
-            <w:lang w:val="de-CH"/>
-          </w:rPr>
-          <w:t>Abbildung 2: Das Installationspacket auswählen</w:t>
-        </w:r>
-        <w:r>
-          <w:rPr>
-            <w:noProof/>
-            <w:webHidden/>
-            <w:lang w:val="de-CH"/>
-          </w:rPr>
-          <w:tab/>
-        </w:r>
-        <w:r>
-          <w:rPr>
-            <w:noProof/>
-            <w:webHidden/>
-            <w:lang w:val="de-CH"/>
-          </w:rPr>
-          <w:fldChar w:fldCharType="begin"/>
-        </w:r>
-        <w:r>
-          <w:rPr>
-            <w:noProof/>
-            <w:webHidden/>
-            <w:lang w:val="de-CH"/>
-          </w:rPr>
-          <w:instrText xml:space="preserve"> PAGEREF _Toc114749718 \h </w:instrText>
-        </w:r>
-        <w:r>
-          <w:rPr>
-            <w:noProof/>
-            <w:webHidden/>
-            <w:lang w:val="de-CH"/>
-          </w:rPr>
-        </w:r>
-        <w:r>
-          <w:rPr>
-            <w:noProof/>
-            <w:webHidden/>
-            <w:lang w:val="de-CH"/>
-          </w:rPr>
-          <w:fldChar w:fldCharType="separate"/>
-        </w:r>
-        <w:r>
-          <w:rPr>
-            <w:noProof/>
-            <w:webHidden/>
-            <w:lang w:val="de-CH"/>
-          </w:rPr>
-          <w:t>2</w:t>
-        </w:r>
-        <w:r>
-          <w:rPr>
-            <w:noProof/>
-            <w:webHidden/>
-            <w:lang w:val="de-CH"/>
-          </w:rPr>
-          <w:fldChar w:fldCharType="end"/>
-        </w:r>
-      </w:hyperlink>
-    </w:p>
-    <w:p>
-      <w:pPr>
-        <w:pStyle w:val="berschrift1"/>
-        <w:numPr>
-          <w:ilvl w:val="0"/>
-          <w:numId w:val="1"/>
-        </w:numPr>
-        <w:rPr>
-          <w:noProof/>
-        </w:rPr>
-      </w:pPr>
-      <w:r>
-        <w:rPr>
-          <w:lang w:val="de-CH"/>
-        </w:rPr>
-        <w:fldChar w:fldCharType="end"/>
-      </w:r>
-      <w:bookmarkStart w:id="18" w:name="_Toc114757484"/>
-      <w:r>
-        <w:rPr>
-          <w:lang w:val="de-CH"/>
-        </w:rPr>
-        <w:t>Tabellenverzeichnis</w:t>
-      </w:r>
-      <w:bookmarkEnd w:id="18"/>
-      <w:r>
-        <w:rPr>
-          <w:lang w:val="de-CH"/>
-        </w:rPr>
-        <w:fldChar w:fldCharType="begin"/>
-      </w:r>
-      <w:r>
-        <w:rPr>
-          <w:lang w:val="de-CH"/>
-        </w:rPr>
-        <w:instrText xml:space="preserve"> TOC \h \z \c "Tabelle" </w:instrText>
-      </w:r>
-      <w:r>
-        <w:rPr>
-          <w:lang w:val="de-CH"/>
-        </w:rPr>
-        <w:fldChar w:fldCharType="separate"/>
-      </w:r>
-    </w:p>
-    <w:p>
-      <w:pPr>
-        <w:pStyle w:val="Abbildungsverzeichnis"/>
-        <w:tabs>
-          <w:tab w:val="right" w:leader="dot" w:pos="9062"/>
-        </w:tabs>
-        <w:rPr>
-          <w:rFonts w:eastAsiaTheme="minorEastAsia"/>
-          <w:noProof/>
-          <w:lang w:eastAsia="de-DE"/>
-        </w:rPr>
-      </w:pPr>
-      <w:hyperlink w:anchor="_Toc114757344" w:history="1">
-        <w:r>
-          <w:rPr>
-            <w:rStyle w:val="Hyperlink"/>
-            <w:noProof/>
-          </w:rPr>
-          <w:t>Tabelle 1: details.php:</w:t>
         </w:r>
         <w:r>
           <w:rPr>
@@ -22218,7 +23013,1383 @@
             <w:noProof/>
             <w:webHidden/>
           </w:rPr>
-          <w:instrText xml:space="preserve"> PAGEREF _Toc114757344 \h </w:instrText>
+          <w:instrText xml:space="preserve"> PAGEREF _Toc114815350 \h </w:instrText>
+        </w:r>
+        <w:r>
+          <w:rPr>
+            <w:noProof/>
+            <w:webHidden/>
+          </w:rPr>
+        </w:r>
+        <w:r>
+          <w:rPr>
+            <w:noProof/>
+            <w:webHidden/>
+          </w:rPr>
+          <w:fldChar w:fldCharType="separate"/>
+        </w:r>
+        <w:r>
+          <w:rPr>
+            <w:noProof/>
+            <w:webHidden/>
+          </w:rPr>
+          <w:t>2</w:t>
+        </w:r>
+        <w:r>
+          <w:rPr>
+            <w:noProof/>
+            <w:webHidden/>
+          </w:rPr>
+          <w:fldChar w:fldCharType="end"/>
+        </w:r>
+      </w:hyperlink>
+    </w:p>
+    <w:p>
+      <w:pPr>
+        <w:pStyle w:val="Abbildungsverzeichnis"/>
+        <w:tabs>
+          <w:tab w:val="right" w:leader="dot" w:pos="9062"/>
+        </w:tabs>
+        <w:rPr>
+          <w:rFonts w:eastAsiaTheme="minorEastAsia"/>
+          <w:noProof/>
+          <w:lang w:eastAsia="de-DE"/>
+        </w:rPr>
+      </w:pPr>
+      <w:hyperlink w:anchor="_Toc114815351" w:history="1">
+        <w:r>
+          <w:rPr>
+            <w:rStyle w:val="Hyperlink"/>
+            <w:noProof/>
+            <w:lang w:val="de-CH"/>
+          </w:rPr>
+          <w:t>Abbildung 2: Das Installationspacket auswählen</w:t>
+        </w:r>
+        <w:r>
+          <w:rPr>
+            <w:noProof/>
+            <w:webHidden/>
+          </w:rPr>
+          <w:tab/>
+        </w:r>
+        <w:r>
+          <w:rPr>
+            <w:noProof/>
+            <w:webHidden/>
+          </w:rPr>
+          <w:fldChar w:fldCharType="begin"/>
+        </w:r>
+        <w:r>
+          <w:rPr>
+            <w:noProof/>
+            <w:webHidden/>
+          </w:rPr>
+          <w:instrText xml:space="preserve"> PAGEREF _Toc114815351 \h </w:instrText>
+        </w:r>
+        <w:r>
+          <w:rPr>
+            <w:noProof/>
+            <w:webHidden/>
+          </w:rPr>
+        </w:r>
+        <w:r>
+          <w:rPr>
+            <w:noProof/>
+            <w:webHidden/>
+          </w:rPr>
+          <w:fldChar w:fldCharType="separate"/>
+        </w:r>
+        <w:r>
+          <w:rPr>
+            <w:noProof/>
+            <w:webHidden/>
+          </w:rPr>
+          <w:t>3</w:t>
+        </w:r>
+        <w:r>
+          <w:rPr>
+            <w:noProof/>
+            <w:webHidden/>
+          </w:rPr>
+          <w:fldChar w:fldCharType="end"/>
+        </w:r>
+      </w:hyperlink>
+    </w:p>
+    <w:p>
+      <w:pPr>
+        <w:pStyle w:val="Abbildungsverzeichnis"/>
+        <w:tabs>
+          <w:tab w:val="right" w:leader="dot" w:pos="9062"/>
+        </w:tabs>
+        <w:rPr>
+          <w:rFonts w:eastAsiaTheme="minorEastAsia"/>
+          <w:noProof/>
+          <w:lang w:eastAsia="de-DE"/>
+        </w:rPr>
+      </w:pPr>
+      <w:hyperlink w:anchor="_Toc114815352" w:history="1">
+        <w:r>
+          <w:rPr>
+            <w:rStyle w:val="Hyperlink"/>
+            <w:noProof/>
+          </w:rPr>
+          <w:t>Abbildung 3: Ordnerstruktur</w:t>
+        </w:r>
+        <w:r>
+          <w:rPr>
+            <w:noProof/>
+            <w:webHidden/>
+          </w:rPr>
+          <w:tab/>
+        </w:r>
+        <w:r>
+          <w:rPr>
+            <w:noProof/>
+            <w:webHidden/>
+          </w:rPr>
+          <w:fldChar w:fldCharType="begin"/>
+        </w:r>
+        <w:r>
+          <w:rPr>
+            <w:noProof/>
+            <w:webHidden/>
+          </w:rPr>
+          <w:instrText xml:space="preserve"> PAGEREF _Toc114815352 \h </w:instrText>
+        </w:r>
+        <w:r>
+          <w:rPr>
+            <w:noProof/>
+            <w:webHidden/>
+          </w:rPr>
+        </w:r>
+        <w:r>
+          <w:rPr>
+            <w:noProof/>
+            <w:webHidden/>
+          </w:rPr>
+          <w:fldChar w:fldCharType="separate"/>
+        </w:r>
+        <w:r>
+          <w:rPr>
+            <w:noProof/>
+            <w:webHidden/>
+          </w:rPr>
+          <w:t>3</w:t>
+        </w:r>
+        <w:r>
+          <w:rPr>
+            <w:noProof/>
+            <w:webHidden/>
+          </w:rPr>
+          <w:fldChar w:fldCharType="end"/>
+        </w:r>
+      </w:hyperlink>
+    </w:p>
+    <w:p>
+      <w:pPr>
+        <w:pStyle w:val="Abbildungsverzeichnis"/>
+        <w:tabs>
+          <w:tab w:val="right" w:leader="dot" w:pos="9062"/>
+        </w:tabs>
+        <w:rPr>
+          <w:rFonts w:eastAsiaTheme="minorEastAsia"/>
+          <w:noProof/>
+          <w:lang w:eastAsia="de-DE"/>
+        </w:rPr>
+      </w:pPr>
+      <w:hyperlink w:anchor="_Toc114815353" w:history="1">
+        <w:r>
+          <w:rPr>
+            <w:rStyle w:val="Hyperlink"/>
+            <w:noProof/>
+            <w:lang w:val="de-CH"/>
+          </w:rPr>
+          <w:t>Abbildung 4: Das Aussehen des heruntergeladenen Texteditors</w:t>
+        </w:r>
+        <w:r>
+          <w:rPr>
+            <w:noProof/>
+            <w:webHidden/>
+          </w:rPr>
+          <w:tab/>
+        </w:r>
+        <w:r>
+          <w:rPr>
+            <w:noProof/>
+            <w:webHidden/>
+          </w:rPr>
+          <w:fldChar w:fldCharType="begin"/>
+        </w:r>
+        <w:r>
+          <w:rPr>
+            <w:noProof/>
+            <w:webHidden/>
+          </w:rPr>
+          <w:instrText xml:space="preserve"> PAGEREF _Toc114815353 \h </w:instrText>
+        </w:r>
+        <w:r>
+          <w:rPr>
+            <w:noProof/>
+            <w:webHidden/>
+          </w:rPr>
+        </w:r>
+        <w:r>
+          <w:rPr>
+            <w:noProof/>
+            <w:webHidden/>
+          </w:rPr>
+          <w:fldChar w:fldCharType="separate"/>
+        </w:r>
+        <w:r>
+          <w:rPr>
+            <w:noProof/>
+            <w:webHidden/>
+          </w:rPr>
+          <w:t>5</w:t>
+        </w:r>
+        <w:r>
+          <w:rPr>
+            <w:noProof/>
+            <w:webHidden/>
+          </w:rPr>
+          <w:fldChar w:fldCharType="end"/>
+        </w:r>
+      </w:hyperlink>
+    </w:p>
+    <w:p>
+      <w:pPr>
+        <w:pStyle w:val="Abbildungsverzeichnis"/>
+        <w:tabs>
+          <w:tab w:val="right" w:leader="dot" w:pos="9062"/>
+        </w:tabs>
+        <w:rPr>
+          <w:rFonts w:eastAsiaTheme="minorEastAsia"/>
+          <w:noProof/>
+          <w:lang w:eastAsia="de-DE"/>
+        </w:rPr>
+      </w:pPr>
+      <w:hyperlink w:anchor="_Toc114815354" w:history="1">
+        <w:r>
+          <w:rPr>
+            <w:rStyle w:val="Hyperlink"/>
+            <w:noProof/>
+          </w:rPr>
+          <w:t>Abbildung 5: Das Aussehen des heruntergeladenen Texteditors nach Anwendung von CSS</w:t>
+        </w:r>
+        <w:r>
+          <w:rPr>
+            <w:noProof/>
+            <w:webHidden/>
+          </w:rPr>
+          <w:tab/>
+        </w:r>
+        <w:r>
+          <w:rPr>
+            <w:noProof/>
+            <w:webHidden/>
+          </w:rPr>
+          <w:fldChar w:fldCharType="begin"/>
+        </w:r>
+        <w:r>
+          <w:rPr>
+            <w:noProof/>
+            <w:webHidden/>
+          </w:rPr>
+          <w:instrText xml:space="preserve"> PAGEREF _Toc114815354 \h </w:instrText>
+        </w:r>
+        <w:r>
+          <w:rPr>
+            <w:noProof/>
+            <w:webHidden/>
+          </w:rPr>
+        </w:r>
+        <w:r>
+          <w:rPr>
+            <w:noProof/>
+            <w:webHidden/>
+          </w:rPr>
+          <w:fldChar w:fldCharType="separate"/>
+        </w:r>
+        <w:r>
+          <w:rPr>
+            <w:noProof/>
+            <w:webHidden/>
+          </w:rPr>
+          <w:t>5</w:t>
+        </w:r>
+        <w:r>
+          <w:rPr>
+            <w:noProof/>
+            <w:webHidden/>
+          </w:rPr>
+          <w:fldChar w:fldCharType="end"/>
+        </w:r>
+      </w:hyperlink>
+    </w:p>
+    <w:p>
+      <w:pPr>
+        <w:pStyle w:val="Abbildungsverzeichnis"/>
+        <w:tabs>
+          <w:tab w:val="right" w:leader="dot" w:pos="9062"/>
+        </w:tabs>
+        <w:rPr>
+          <w:rFonts w:eastAsiaTheme="minorEastAsia"/>
+          <w:noProof/>
+          <w:lang w:eastAsia="de-DE"/>
+        </w:rPr>
+      </w:pPr>
+      <w:hyperlink w:anchor="_Toc114815355" w:history="1">
+        <w:r>
+          <w:rPr>
+            <w:rStyle w:val="Hyperlink"/>
+            <w:noProof/>
+          </w:rPr>
+          <w:t>Abbildung 6: Steuerelemente</w:t>
+        </w:r>
+        <w:r>
+          <w:rPr>
+            <w:noProof/>
+            <w:webHidden/>
+          </w:rPr>
+          <w:tab/>
+        </w:r>
+        <w:r>
+          <w:rPr>
+            <w:noProof/>
+            <w:webHidden/>
+          </w:rPr>
+          <w:fldChar w:fldCharType="begin"/>
+        </w:r>
+        <w:r>
+          <w:rPr>
+            <w:noProof/>
+            <w:webHidden/>
+          </w:rPr>
+          <w:instrText xml:space="preserve"> PAGEREF _Toc114815355 \h </w:instrText>
+        </w:r>
+        <w:r>
+          <w:rPr>
+            <w:noProof/>
+            <w:webHidden/>
+          </w:rPr>
+        </w:r>
+        <w:r>
+          <w:rPr>
+            <w:noProof/>
+            <w:webHidden/>
+          </w:rPr>
+          <w:fldChar w:fldCharType="separate"/>
+        </w:r>
+        <w:r>
+          <w:rPr>
+            <w:noProof/>
+            <w:webHidden/>
+          </w:rPr>
+          <w:t>10</w:t>
+        </w:r>
+        <w:r>
+          <w:rPr>
+            <w:noProof/>
+            <w:webHidden/>
+          </w:rPr>
+          <w:fldChar w:fldCharType="end"/>
+        </w:r>
+      </w:hyperlink>
+    </w:p>
+    <w:p>
+      <w:pPr>
+        <w:pStyle w:val="Abbildungsverzeichnis"/>
+        <w:tabs>
+          <w:tab w:val="right" w:leader="dot" w:pos="9062"/>
+        </w:tabs>
+        <w:rPr>
+          <w:rFonts w:eastAsiaTheme="minorEastAsia"/>
+          <w:noProof/>
+          <w:lang w:eastAsia="de-DE"/>
+        </w:rPr>
+      </w:pPr>
+      <w:hyperlink w:anchor="_Toc114815356" w:history="1">
+        <w:r>
+          <w:rPr>
+            <w:rStyle w:val="Hyperlink"/>
+            <w:noProof/>
+          </w:rPr>
+          <w:t>Abbildung 7: Originalversion des Bereichs "plugins"</w:t>
+        </w:r>
+        <w:r>
+          <w:rPr>
+            <w:noProof/>
+            <w:webHidden/>
+          </w:rPr>
+          <w:tab/>
+        </w:r>
+        <w:r>
+          <w:rPr>
+            <w:noProof/>
+            <w:webHidden/>
+          </w:rPr>
+          <w:fldChar w:fldCharType="begin"/>
+        </w:r>
+        <w:r>
+          <w:rPr>
+            <w:noProof/>
+            <w:webHidden/>
+          </w:rPr>
+          <w:instrText xml:space="preserve"> PAGEREF _Toc114815356 \h </w:instrText>
+        </w:r>
+        <w:r>
+          <w:rPr>
+            <w:noProof/>
+            <w:webHidden/>
+          </w:rPr>
+        </w:r>
+        <w:r>
+          <w:rPr>
+            <w:noProof/>
+            <w:webHidden/>
+          </w:rPr>
+          <w:fldChar w:fldCharType="separate"/>
+        </w:r>
+        <w:r>
+          <w:rPr>
+            <w:noProof/>
+            <w:webHidden/>
+          </w:rPr>
+          <w:t>12</w:t>
+        </w:r>
+        <w:r>
+          <w:rPr>
+            <w:noProof/>
+            <w:webHidden/>
+          </w:rPr>
+          <w:fldChar w:fldCharType="end"/>
+        </w:r>
+      </w:hyperlink>
+    </w:p>
+    <w:p>
+      <w:pPr>
+        <w:pStyle w:val="Abbildungsverzeichnis"/>
+        <w:tabs>
+          <w:tab w:val="right" w:leader="dot" w:pos="9062"/>
+        </w:tabs>
+        <w:rPr>
+          <w:rFonts w:eastAsiaTheme="minorEastAsia"/>
+          <w:noProof/>
+          <w:lang w:eastAsia="de-DE"/>
+        </w:rPr>
+      </w:pPr>
+      <w:hyperlink w:anchor="_Toc114815357" w:history="1">
+        <w:r>
+          <w:rPr>
+            <w:rStyle w:val="Hyperlink"/>
+            <w:noProof/>
+          </w:rPr>
+          <w:t>Abbildung 8: Für das Beispiel abgeänderte File im Bereich "plugins"</w:t>
+        </w:r>
+        <w:r>
+          <w:rPr>
+            <w:noProof/>
+            <w:webHidden/>
+          </w:rPr>
+          <w:tab/>
+        </w:r>
+        <w:r>
+          <w:rPr>
+            <w:noProof/>
+            <w:webHidden/>
+          </w:rPr>
+          <w:fldChar w:fldCharType="begin"/>
+        </w:r>
+        <w:r>
+          <w:rPr>
+            <w:noProof/>
+            <w:webHidden/>
+          </w:rPr>
+          <w:instrText xml:space="preserve"> PAGEREF _Toc114815357 \h </w:instrText>
+        </w:r>
+        <w:r>
+          <w:rPr>
+            <w:noProof/>
+            <w:webHidden/>
+          </w:rPr>
+        </w:r>
+        <w:r>
+          <w:rPr>
+            <w:noProof/>
+            <w:webHidden/>
+          </w:rPr>
+          <w:fldChar w:fldCharType="separate"/>
+        </w:r>
+        <w:r>
+          <w:rPr>
+            <w:noProof/>
+            <w:webHidden/>
+          </w:rPr>
+          <w:t>13</w:t>
+        </w:r>
+        <w:r>
+          <w:rPr>
+            <w:noProof/>
+            <w:webHidden/>
+          </w:rPr>
+          <w:fldChar w:fldCharType="end"/>
+        </w:r>
+      </w:hyperlink>
+    </w:p>
+    <w:p>
+      <w:pPr>
+        <w:pStyle w:val="Abbildungsverzeichnis"/>
+        <w:tabs>
+          <w:tab w:val="right" w:leader="dot" w:pos="9062"/>
+        </w:tabs>
+        <w:rPr>
+          <w:rFonts w:eastAsiaTheme="minorEastAsia"/>
+          <w:noProof/>
+          <w:lang w:eastAsia="de-DE"/>
+        </w:rPr>
+      </w:pPr>
+      <w:hyperlink w:anchor="_Toc114815358" w:history="1">
+        <w:r>
+          <w:rPr>
+            <w:rStyle w:val="Hyperlink"/>
+            <w:noProof/>
+          </w:rPr>
+          <w:t>Abbildung 9: Auswahl der Version</w:t>
+        </w:r>
+        <w:r>
+          <w:rPr>
+            <w:noProof/>
+            <w:webHidden/>
+          </w:rPr>
+          <w:tab/>
+        </w:r>
+        <w:r>
+          <w:rPr>
+            <w:noProof/>
+            <w:webHidden/>
+          </w:rPr>
+          <w:fldChar w:fldCharType="begin"/>
+        </w:r>
+        <w:r>
+          <w:rPr>
+            <w:noProof/>
+            <w:webHidden/>
+          </w:rPr>
+          <w:instrText xml:space="preserve"> PAGEREF _Toc114815358 \h </w:instrText>
+        </w:r>
+        <w:r>
+          <w:rPr>
+            <w:noProof/>
+            <w:webHidden/>
+          </w:rPr>
+        </w:r>
+        <w:r>
+          <w:rPr>
+            <w:noProof/>
+            <w:webHidden/>
+          </w:rPr>
+          <w:fldChar w:fldCharType="separate"/>
+        </w:r>
+        <w:r>
+          <w:rPr>
+            <w:noProof/>
+            <w:webHidden/>
+          </w:rPr>
+          <w:t>13</w:t>
+        </w:r>
+        <w:r>
+          <w:rPr>
+            <w:noProof/>
+            <w:webHidden/>
+          </w:rPr>
+          <w:fldChar w:fldCharType="end"/>
+        </w:r>
+      </w:hyperlink>
+    </w:p>
+    <w:p>
+      <w:pPr>
+        <w:pStyle w:val="Abbildungsverzeichnis"/>
+        <w:tabs>
+          <w:tab w:val="right" w:leader="dot" w:pos="9062"/>
+        </w:tabs>
+        <w:rPr>
+          <w:rFonts w:eastAsiaTheme="minorEastAsia"/>
+          <w:noProof/>
+          <w:lang w:eastAsia="de-DE"/>
+        </w:rPr>
+      </w:pPr>
+      <w:hyperlink w:anchor="_Toc114815359" w:history="1">
+        <w:r>
+          <w:rPr>
+            <w:rStyle w:val="Hyperlink"/>
+            <w:noProof/>
+          </w:rPr>
+          <w:t>Abbildung 10: Übersicht von den Plugins, die enthalten sind</w:t>
+        </w:r>
+        <w:r>
+          <w:rPr>
+            <w:noProof/>
+            <w:webHidden/>
+          </w:rPr>
+          <w:tab/>
+        </w:r>
+        <w:r>
+          <w:rPr>
+            <w:noProof/>
+            <w:webHidden/>
+          </w:rPr>
+          <w:fldChar w:fldCharType="begin"/>
+        </w:r>
+        <w:r>
+          <w:rPr>
+            <w:noProof/>
+            <w:webHidden/>
+          </w:rPr>
+          <w:instrText xml:space="preserve"> PAGEREF _Toc114815359 \h </w:instrText>
+        </w:r>
+        <w:r>
+          <w:rPr>
+            <w:noProof/>
+            <w:webHidden/>
+          </w:rPr>
+        </w:r>
+        <w:r>
+          <w:rPr>
+            <w:noProof/>
+            <w:webHidden/>
+          </w:rPr>
+          <w:fldChar w:fldCharType="separate"/>
+        </w:r>
+        <w:r>
+          <w:rPr>
+            <w:noProof/>
+            <w:webHidden/>
+          </w:rPr>
+          <w:t>13</w:t>
+        </w:r>
+        <w:r>
+          <w:rPr>
+            <w:noProof/>
+            <w:webHidden/>
+          </w:rPr>
+          <w:fldChar w:fldCharType="end"/>
+        </w:r>
+      </w:hyperlink>
+    </w:p>
+    <w:p>
+      <w:pPr>
+        <w:pStyle w:val="Abbildungsverzeichnis"/>
+        <w:tabs>
+          <w:tab w:val="right" w:leader="dot" w:pos="9062"/>
+        </w:tabs>
+        <w:rPr>
+          <w:rFonts w:eastAsiaTheme="minorEastAsia"/>
+          <w:noProof/>
+          <w:lang w:eastAsia="de-DE"/>
+        </w:rPr>
+      </w:pPr>
+      <w:hyperlink w:anchor="_Toc114815360" w:history="1">
+        <w:r>
+          <w:rPr>
+            <w:rStyle w:val="Hyperlink"/>
+            <w:noProof/>
+          </w:rPr>
+          <w:t>Abbildung 11: Den Skin des Texteditor-Manipulators ändern</w:t>
+        </w:r>
+        <w:r>
+          <w:rPr>
+            <w:noProof/>
+            <w:webHidden/>
+          </w:rPr>
+          <w:tab/>
+        </w:r>
+        <w:r>
+          <w:rPr>
+            <w:noProof/>
+            <w:webHidden/>
+          </w:rPr>
+          <w:fldChar w:fldCharType="begin"/>
+        </w:r>
+        <w:r>
+          <w:rPr>
+            <w:noProof/>
+            <w:webHidden/>
+          </w:rPr>
+          <w:instrText xml:space="preserve"> PAGEREF _Toc114815360 \h </w:instrText>
+        </w:r>
+        <w:r>
+          <w:rPr>
+            <w:noProof/>
+            <w:webHidden/>
+          </w:rPr>
+        </w:r>
+        <w:r>
+          <w:rPr>
+            <w:noProof/>
+            <w:webHidden/>
+          </w:rPr>
+          <w:fldChar w:fldCharType="separate"/>
+        </w:r>
+        <w:r>
+          <w:rPr>
+            <w:noProof/>
+            <w:webHidden/>
+          </w:rPr>
+          <w:t>14</w:t>
+        </w:r>
+        <w:r>
+          <w:rPr>
+            <w:noProof/>
+            <w:webHidden/>
+          </w:rPr>
+          <w:fldChar w:fldCharType="end"/>
+        </w:r>
+      </w:hyperlink>
+    </w:p>
+    <w:p>
+      <w:pPr>
+        <w:pStyle w:val="Abbildungsverzeichnis"/>
+        <w:tabs>
+          <w:tab w:val="right" w:leader="dot" w:pos="9062"/>
+        </w:tabs>
+        <w:rPr>
+          <w:rFonts w:eastAsiaTheme="minorEastAsia"/>
+          <w:noProof/>
+          <w:lang w:eastAsia="de-DE"/>
+        </w:rPr>
+      </w:pPr>
+      <w:hyperlink w:anchor="_Toc114815361" w:history="1">
+        <w:r>
+          <w:rPr>
+            <w:rStyle w:val="Hyperlink"/>
+            <w:noProof/>
+          </w:rPr>
+          <w:t>Abbildung 12: Sprache auswählen und herunterladen</w:t>
+        </w:r>
+        <w:r>
+          <w:rPr>
+            <w:noProof/>
+            <w:webHidden/>
+          </w:rPr>
+          <w:tab/>
+        </w:r>
+        <w:r>
+          <w:rPr>
+            <w:noProof/>
+            <w:webHidden/>
+          </w:rPr>
+          <w:fldChar w:fldCharType="begin"/>
+        </w:r>
+        <w:r>
+          <w:rPr>
+            <w:noProof/>
+            <w:webHidden/>
+          </w:rPr>
+          <w:instrText xml:space="preserve"> PAGEREF _Toc114815361 \h </w:instrText>
+        </w:r>
+        <w:r>
+          <w:rPr>
+            <w:noProof/>
+            <w:webHidden/>
+          </w:rPr>
+        </w:r>
+        <w:r>
+          <w:rPr>
+            <w:noProof/>
+            <w:webHidden/>
+          </w:rPr>
+          <w:fldChar w:fldCharType="separate"/>
+        </w:r>
+        <w:r>
+          <w:rPr>
+            <w:noProof/>
+            <w:webHidden/>
+          </w:rPr>
+          <w:t>14</w:t>
+        </w:r>
+        <w:r>
+          <w:rPr>
+            <w:noProof/>
+            <w:webHidden/>
+          </w:rPr>
+          <w:fldChar w:fldCharType="end"/>
+        </w:r>
+      </w:hyperlink>
+    </w:p>
+    <w:p>
+      <w:pPr>
+        <w:pStyle w:val="Abbildungsverzeichnis"/>
+        <w:tabs>
+          <w:tab w:val="right" w:leader="dot" w:pos="9062"/>
+        </w:tabs>
+        <w:rPr>
+          <w:rFonts w:eastAsiaTheme="minorEastAsia"/>
+          <w:noProof/>
+          <w:lang w:eastAsia="de-DE"/>
+        </w:rPr>
+      </w:pPr>
+      <w:hyperlink w:anchor="_Toc114815362" w:history="1">
+        <w:r>
+          <w:rPr>
+            <w:rStyle w:val="Hyperlink"/>
+            <w:noProof/>
+          </w:rPr>
+          <w:t>Abbildung 13: Anzeige der Veränderung</w:t>
+        </w:r>
+        <w:r>
+          <w:rPr>
+            <w:noProof/>
+            <w:webHidden/>
+          </w:rPr>
+          <w:tab/>
+        </w:r>
+        <w:r>
+          <w:rPr>
+            <w:noProof/>
+            <w:webHidden/>
+          </w:rPr>
+          <w:fldChar w:fldCharType="begin"/>
+        </w:r>
+        <w:r>
+          <w:rPr>
+            <w:noProof/>
+            <w:webHidden/>
+          </w:rPr>
+          <w:instrText xml:space="preserve"> PAGEREF _Toc114815362 \h </w:instrText>
+        </w:r>
+        <w:r>
+          <w:rPr>
+            <w:noProof/>
+            <w:webHidden/>
+          </w:rPr>
+        </w:r>
+        <w:r>
+          <w:rPr>
+            <w:noProof/>
+            <w:webHidden/>
+          </w:rPr>
+          <w:fldChar w:fldCharType="separate"/>
+        </w:r>
+        <w:r>
+          <w:rPr>
+            <w:noProof/>
+            <w:webHidden/>
+          </w:rPr>
+          <w:t>14</w:t>
+        </w:r>
+        <w:r>
+          <w:rPr>
+            <w:noProof/>
+            <w:webHidden/>
+          </w:rPr>
+          <w:fldChar w:fldCharType="end"/>
+        </w:r>
+      </w:hyperlink>
+    </w:p>
+    <w:p>
+      <w:pPr>
+        <w:pStyle w:val="berschrift1"/>
+        <w:numPr>
+          <w:ilvl w:val="0"/>
+          <w:numId w:val="1"/>
+        </w:numPr>
+        <w:rPr>
+          <w:noProof/>
+        </w:rPr>
+      </w:pPr>
+      <w:r>
+        <w:rPr>
+          <w:lang w:val="de-CH"/>
+        </w:rPr>
+        <w:fldChar w:fldCharType="end"/>
+      </w:r>
+      <w:bookmarkStart w:id="35" w:name="_Toc114757484"/>
+      <w:r>
+        <w:rPr>
+          <w:lang w:val="de-CH"/>
+        </w:rPr>
+        <w:t>Tabellenverzeichnis</w:t>
+      </w:r>
+      <w:bookmarkEnd w:id="35"/>
+      <w:r>
+        <w:rPr>
+          <w:lang w:val="de-CH"/>
+        </w:rPr>
+        <w:fldChar w:fldCharType="begin"/>
+      </w:r>
+      <w:r>
+        <w:rPr>
+          <w:lang w:val="de-CH"/>
+        </w:rPr>
+        <w:instrText xml:space="preserve"> TOC \h \z \c "Tabelle" </w:instrText>
+      </w:r>
+      <w:r>
+        <w:rPr>
+          <w:lang w:val="de-CH"/>
+        </w:rPr>
+        <w:fldChar w:fldCharType="separate"/>
+      </w:r>
+    </w:p>
+    <w:p>
+      <w:pPr>
+        <w:pStyle w:val="Abbildungsverzeichnis"/>
+        <w:tabs>
+          <w:tab w:val="right" w:leader="dot" w:pos="9062"/>
+        </w:tabs>
+        <w:rPr>
+          <w:rFonts w:eastAsiaTheme="minorEastAsia"/>
+          <w:noProof/>
+          <w:lang w:eastAsia="de-DE"/>
+        </w:rPr>
+      </w:pPr>
+      <w:hyperlink w:anchor="_Toc114815363" w:history="1">
+        <w:r>
+          <w:rPr>
+            <w:rStyle w:val="Hyperlink"/>
+            <w:noProof/>
+          </w:rPr>
+          <w:t>Tabelle 1: dashboard.php</w:t>
+        </w:r>
+        <w:r>
+          <w:rPr>
+            <w:noProof/>
+            <w:webHidden/>
+          </w:rPr>
+          <w:tab/>
+        </w:r>
+        <w:r>
+          <w:rPr>
+            <w:noProof/>
+            <w:webHidden/>
+          </w:rPr>
+          <w:fldChar w:fldCharType="begin"/>
+        </w:r>
+        <w:r>
+          <w:rPr>
+            <w:noProof/>
+            <w:webHidden/>
+          </w:rPr>
+          <w:instrText xml:space="preserve"> PAGEREF _Toc114815363 \h </w:instrText>
+        </w:r>
+        <w:r>
+          <w:rPr>
+            <w:noProof/>
+            <w:webHidden/>
+          </w:rPr>
+        </w:r>
+        <w:r>
+          <w:rPr>
+            <w:noProof/>
+            <w:webHidden/>
+          </w:rPr>
+          <w:fldChar w:fldCharType="separate"/>
+        </w:r>
+        <w:r>
+          <w:rPr>
+            <w:noProof/>
+            <w:webHidden/>
+          </w:rPr>
+          <w:t>4</w:t>
+        </w:r>
+        <w:r>
+          <w:rPr>
+            <w:noProof/>
+            <w:webHidden/>
+          </w:rPr>
+          <w:fldChar w:fldCharType="end"/>
+        </w:r>
+      </w:hyperlink>
+    </w:p>
+    <w:p>
+      <w:pPr>
+        <w:pStyle w:val="Abbildungsverzeichnis"/>
+        <w:tabs>
+          <w:tab w:val="right" w:leader="dot" w:pos="9062"/>
+        </w:tabs>
+        <w:rPr>
+          <w:rFonts w:eastAsiaTheme="minorEastAsia"/>
+          <w:noProof/>
+          <w:lang w:eastAsia="de-DE"/>
+        </w:rPr>
+      </w:pPr>
+      <w:hyperlink w:anchor="_Toc114815364" w:history="1">
+        <w:r>
+          <w:rPr>
+            <w:rStyle w:val="Hyperlink"/>
+            <w:noProof/>
+          </w:rPr>
+          <w:t>Tabelle 2: css/style.css</w:t>
+        </w:r>
+        <w:r>
+          <w:rPr>
+            <w:noProof/>
+            <w:webHidden/>
+          </w:rPr>
+          <w:tab/>
+        </w:r>
+        <w:r>
+          <w:rPr>
+            <w:noProof/>
+            <w:webHidden/>
+          </w:rPr>
+          <w:fldChar w:fldCharType="begin"/>
+        </w:r>
+        <w:r>
+          <w:rPr>
+            <w:noProof/>
+            <w:webHidden/>
+          </w:rPr>
+          <w:instrText xml:space="preserve"> PAGEREF _Toc114815364 \h </w:instrText>
+        </w:r>
+        <w:r>
+          <w:rPr>
+            <w:noProof/>
+            <w:webHidden/>
+          </w:rPr>
+        </w:r>
+        <w:r>
+          <w:rPr>
+            <w:noProof/>
+            <w:webHidden/>
+          </w:rPr>
+          <w:fldChar w:fldCharType="separate"/>
+        </w:r>
+        <w:r>
+          <w:rPr>
+            <w:noProof/>
+            <w:webHidden/>
+          </w:rPr>
+          <w:t>5</w:t>
+        </w:r>
+        <w:r>
+          <w:rPr>
+            <w:noProof/>
+            <w:webHidden/>
+          </w:rPr>
+          <w:fldChar w:fldCharType="end"/>
+        </w:r>
+      </w:hyperlink>
+    </w:p>
+    <w:p>
+      <w:pPr>
+        <w:pStyle w:val="Abbildungsverzeichnis"/>
+        <w:tabs>
+          <w:tab w:val="right" w:leader="dot" w:pos="9062"/>
+        </w:tabs>
+        <w:rPr>
+          <w:rFonts w:eastAsiaTheme="minorEastAsia"/>
+          <w:noProof/>
+          <w:lang w:eastAsia="de-DE"/>
+        </w:rPr>
+      </w:pPr>
+      <w:hyperlink w:anchor="_Toc114815365" w:history="1">
+        <w:r>
+          <w:rPr>
+            <w:rStyle w:val="Hyperlink"/>
+            <w:noProof/>
+          </w:rPr>
+          <w:t>Tabelle 3: db_connection.php</w:t>
+        </w:r>
+        <w:r>
+          <w:rPr>
+            <w:noProof/>
+            <w:webHidden/>
+          </w:rPr>
+          <w:tab/>
+        </w:r>
+        <w:r>
+          <w:rPr>
+            <w:noProof/>
+            <w:webHidden/>
+          </w:rPr>
+          <w:fldChar w:fldCharType="begin"/>
+        </w:r>
+        <w:r>
+          <w:rPr>
+            <w:noProof/>
+            <w:webHidden/>
+          </w:rPr>
+          <w:instrText xml:space="preserve"> PAGEREF _Toc114815365 \h </w:instrText>
+        </w:r>
+        <w:r>
+          <w:rPr>
+            <w:noProof/>
+            <w:webHidden/>
+          </w:rPr>
+        </w:r>
+        <w:r>
+          <w:rPr>
+            <w:noProof/>
+            <w:webHidden/>
+          </w:rPr>
+          <w:fldChar w:fldCharType="separate"/>
+        </w:r>
+        <w:r>
+          <w:rPr>
+            <w:noProof/>
+            <w:webHidden/>
+          </w:rPr>
+          <w:t>6</w:t>
+        </w:r>
+        <w:r>
+          <w:rPr>
+            <w:noProof/>
+            <w:webHidden/>
+          </w:rPr>
+          <w:fldChar w:fldCharType="end"/>
+        </w:r>
+      </w:hyperlink>
+    </w:p>
+    <w:p>
+      <w:pPr>
+        <w:pStyle w:val="Abbildungsverzeichnis"/>
+        <w:tabs>
+          <w:tab w:val="right" w:leader="dot" w:pos="9062"/>
+        </w:tabs>
+        <w:rPr>
+          <w:rFonts w:eastAsiaTheme="minorEastAsia"/>
+          <w:noProof/>
+          <w:lang w:eastAsia="de-DE"/>
+        </w:rPr>
+      </w:pPr>
+      <w:hyperlink w:anchor="_Toc114815366" w:history="1">
+        <w:r>
+          <w:rPr>
+            <w:rStyle w:val="Hyperlink"/>
+            <w:noProof/>
+          </w:rPr>
+          <w:t>Tabelle 4: texteditor.sql</w:t>
+        </w:r>
+        <w:r>
+          <w:rPr>
+            <w:noProof/>
+            <w:webHidden/>
+          </w:rPr>
+          <w:tab/>
+        </w:r>
+        <w:r>
+          <w:rPr>
+            <w:noProof/>
+            <w:webHidden/>
+          </w:rPr>
+          <w:fldChar w:fldCharType="begin"/>
+        </w:r>
+        <w:r>
+          <w:rPr>
+            <w:noProof/>
+            <w:webHidden/>
+          </w:rPr>
+          <w:instrText xml:space="preserve"> PAGEREF _Toc114815366 \h </w:instrText>
+        </w:r>
+        <w:r>
+          <w:rPr>
+            <w:noProof/>
+            <w:webHidden/>
+          </w:rPr>
+        </w:r>
+        <w:r>
+          <w:rPr>
+            <w:noProof/>
+            <w:webHidden/>
+          </w:rPr>
+          <w:fldChar w:fldCharType="separate"/>
+        </w:r>
+        <w:r>
+          <w:rPr>
+            <w:noProof/>
+            <w:webHidden/>
+          </w:rPr>
+          <w:t>7</w:t>
+        </w:r>
+        <w:r>
+          <w:rPr>
+            <w:noProof/>
+            <w:webHidden/>
+          </w:rPr>
+          <w:fldChar w:fldCharType="end"/>
+        </w:r>
+      </w:hyperlink>
+    </w:p>
+    <w:p>
+      <w:pPr>
+        <w:pStyle w:val="Abbildungsverzeichnis"/>
+        <w:tabs>
+          <w:tab w:val="right" w:leader="dot" w:pos="9062"/>
+        </w:tabs>
+        <w:rPr>
+          <w:rFonts w:eastAsiaTheme="minorEastAsia"/>
+          <w:noProof/>
+          <w:lang w:eastAsia="de-DE"/>
+        </w:rPr>
+      </w:pPr>
+      <w:hyperlink w:anchor="_Toc114815367" w:history="1">
+        <w:r>
+          <w:rPr>
+            <w:rStyle w:val="Hyperlink"/>
+            <w:noProof/>
+          </w:rPr>
+          <w:t>Tabelle 5: process.php</w:t>
+        </w:r>
+        <w:r>
+          <w:rPr>
+            <w:noProof/>
+            <w:webHidden/>
+          </w:rPr>
+          <w:tab/>
+        </w:r>
+        <w:r>
+          <w:rPr>
+            <w:noProof/>
+            <w:webHidden/>
+          </w:rPr>
+          <w:fldChar w:fldCharType="begin"/>
+        </w:r>
+        <w:r>
+          <w:rPr>
+            <w:noProof/>
+            <w:webHidden/>
+          </w:rPr>
+          <w:instrText xml:space="preserve"> PAGEREF _Toc114815367 \h </w:instrText>
+        </w:r>
+        <w:r>
+          <w:rPr>
+            <w:noProof/>
+            <w:webHidden/>
+          </w:rPr>
+        </w:r>
+        <w:r>
+          <w:rPr>
+            <w:noProof/>
+            <w:webHidden/>
+          </w:rPr>
+          <w:fldChar w:fldCharType="separate"/>
+        </w:r>
+        <w:r>
+          <w:rPr>
+            <w:noProof/>
+            <w:webHidden/>
+          </w:rPr>
+          <w:t>7</w:t>
+        </w:r>
+        <w:r>
+          <w:rPr>
+            <w:noProof/>
+            <w:webHidden/>
+          </w:rPr>
+          <w:fldChar w:fldCharType="end"/>
+        </w:r>
+      </w:hyperlink>
+    </w:p>
+    <w:p>
+      <w:pPr>
+        <w:pStyle w:val="Abbildungsverzeichnis"/>
+        <w:tabs>
+          <w:tab w:val="right" w:leader="dot" w:pos="9062"/>
+        </w:tabs>
+        <w:rPr>
+          <w:rFonts w:eastAsiaTheme="minorEastAsia"/>
+          <w:noProof/>
+          <w:lang w:eastAsia="de-DE"/>
+        </w:rPr>
+      </w:pPr>
+      <w:hyperlink w:anchor="_Toc114815368" w:history="1">
+        <w:r>
+          <w:rPr>
+            <w:rStyle w:val="Hyperlink"/>
+            <w:noProof/>
+          </w:rPr>
+          <w:t>Tabelle 6: index.php</w:t>
+        </w:r>
+        <w:r>
+          <w:rPr>
+            <w:noProof/>
+            <w:webHidden/>
+          </w:rPr>
+          <w:tab/>
+        </w:r>
+        <w:r>
+          <w:rPr>
+            <w:noProof/>
+            <w:webHidden/>
+          </w:rPr>
+          <w:fldChar w:fldCharType="begin"/>
+        </w:r>
+        <w:r>
+          <w:rPr>
+            <w:noProof/>
+            <w:webHidden/>
+          </w:rPr>
+          <w:instrText xml:space="preserve"> PAGEREF _Toc114815368 \h </w:instrText>
+        </w:r>
+        <w:r>
+          <w:rPr>
+            <w:noProof/>
+            <w:webHidden/>
+          </w:rPr>
+        </w:r>
+        <w:r>
+          <w:rPr>
+            <w:noProof/>
+            <w:webHidden/>
+          </w:rPr>
+          <w:fldChar w:fldCharType="separate"/>
+        </w:r>
+        <w:r>
+          <w:rPr>
+            <w:noProof/>
+            <w:webHidden/>
+          </w:rPr>
+          <w:t>8</w:t>
+        </w:r>
+        <w:r>
+          <w:rPr>
+            <w:noProof/>
+            <w:webHidden/>
+          </w:rPr>
+          <w:fldChar w:fldCharType="end"/>
+        </w:r>
+      </w:hyperlink>
+    </w:p>
+    <w:p>
+      <w:pPr>
+        <w:pStyle w:val="Abbildungsverzeichnis"/>
+        <w:tabs>
+          <w:tab w:val="right" w:leader="dot" w:pos="9062"/>
+        </w:tabs>
+        <w:rPr>
+          <w:rFonts w:eastAsiaTheme="minorEastAsia"/>
+          <w:noProof/>
+          <w:lang w:eastAsia="de-DE"/>
+        </w:rPr>
+      </w:pPr>
+      <w:hyperlink w:anchor="_Toc114815369" w:history="1">
+        <w:r>
+          <w:rPr>
+            <w:rStyle w:val="Hyperlink"/>
+            <w:noProof/>
+          </w:rPr>
+          <w:t>Tabelle 7: details.php:</w:t>
+        </w:r>
+        <w:r>
+          <w:rPr>
+            <w:noProof/>
+            <w:webHidden/>
+          </w:rPr>
+          <w:tab/>
+        </w:r>
+        <w:r>
+          <w:rPr>
+            <w:noProof/>
+            <w:webHidden/>
+          </w:rPr>
+          <w:fldChar w:fldCharType="begin"/>
+        </w:r>
+        <w:r>
+          <w:rPr>
+            <w:noProof/>
+            <w:webHidden/>
+          </w:rPr>
+          <w:instrText xml:space="preserve"> PAGEREF _Toc114815369 \h </w:instrText>
         </w:r>
         <w:r>
           <w:rPr>

</xml_diff>